<commit_message>
Upload Tugas Pertemuan 4 (RAG Pipeline & AI Agent)
</commit_message>
<xml_diff>
--- a/Laporan Tugas 3_ Agen AI Chatbot Web - Google Sheets & Gemini.docx
+++ b/Laporan Tugas 3_ Agen AI Chatbot Web - Google Sheets & Gemini.docx
@@ -11,6 +11,7 @@
           <w:color w:val="auto"/>
         </w:rPr>
       </w:pPr>
+      <w:bookmarkStart w:id="0" w:name="_GoBack"/>
       <w:r>
         <w:rPr>
           <w:rFonts w:ascii="Times New Roman" w:eastAsia="Times New Roman" w:hAnsi="Times New Roman" w:cs="Times New Roman"/>
@@ -29,8 +30,6 @@
         </w:rPr>
         <w:t>3</w:t>
       </w:r>
-      <w:bookmarkStart w:id="0" w:name="_GoBack"/>
-      <w:bookmarkEnd w:id="0"/>
       <w:r>
         <w:rPr>
           <w:rFonts w:ascii="Times New Roman" w:eastAsia="Times New Roman" w:hAnsi="Times New Roman" w:cs="Times New Roman"/>
@@ -646,70 +645,71 @@
     <w:p>
       <w:pPr>
         <w:pStyle w:val="NormalWeb"/>
-        <w:numPr>
-          <w:ilvl w:val="0"/>
-          <w:numId w:val="12"/>
-        </w:numPr>
-      </w:pPr>
+        <w:ind w:left="720"/>
+      </w:pPr>
+      <w:r>
+        <w:t xml:space="preserve">  </w:t>
+      </w:r>
       <w:r>
         <w:rPr>
           <w:b/>
           <w:bCs/>
         </w:rPr>
-        <w:t>Tugas Chatbot</w:t>
-      </w:r>
-      <w:r>
-        <w:t xml:space="preserve">: Chatbot difungsikan sebagai </w:t>
+        <w:t>Tugas dan Peran Chatbot:</w:t>
+      </w:r>
+    </w:p>
+    <w:p>
+      <w:pPr>
+        <w:pStyle w:val="NormalWeb"/>
+        <w:ind w:left="720"/>
+      </w:pPr>
+      <w:r>
+        <w:t xml:space="preserve">Chatbot ini difungsikan sebagai </w:t>
       </w:r>
       <w:r>
         <w:rPr>
           <w:i/>
           <w:iCs/>
         </w:rPr>
-        <w:t>Customer Service / AI Assistant</w:t>
-      </w:r>
-      <w:r>
-        <w:t xml:space="preserve"> interaktif yang bertugas memberikan informasi mengenai </w:t>
+        <w:t>Customer Service</w:t>
+      </w:r>
+      <w:r>
+        <w:t xml:space="preserve"> (CS) atau </w:t>
+      </w:r>
+      <w:r>
+        <w:rPr>
+          <w:i/>
+          <w:iCs/>
+        </w:rPr>
+        <w:t>AI Virtual Assistant</w:t>
+      </w:r>
+      <w:r>
+        <w:t xml:space="preserve"> interaktif. Tugas utamanya adalah menangani pertanyaan dari calon peserta mengenai daftar program pelatihan, nama kursus, deskripsi cakupan topik materi, hingga rincian biaya atau harga pendaftaran. Chatbot dirancang untuk memberikan jawaban akurat berdasarkan data nyata yang tersimpan di basis data tanpa melakukan halusinasi informasi. </w:t>
+      </w:r>
+    </w:p>
+    <w:p>
+      <w:pPr>
+        <w:pStyle w:val="NormalWeb"/>
+        <w:ind w:left="720"/>
+      </w:pPr>
+      <w:r>
+        <w:t xml:space="preserve">  </w:t>
       </w:r>
       <w:r>
         <w:rPr>
           <w:b/>
           <w:bCs/>
         </w:rPr>
-        <w:t>Program Pelatihan</w:t>
-      </w:r>
-      <w:r>
-        <w:t xml:space="preserve">, </w:t>
-      </w:r>
-      <w:r>
-        <w:rPr>
-          <w:b/>
-          <w:bCs/>
-        </w:rPr>
-        <w:t>Nama Kursus</w:t>
-      </w:r>
-      <w:r>
-        <w:t xml:space="preserve">, </w:t>
-      </w:r>
-      <w:r>
-        <w:rPr>
-          <w:b/>
-          <w:bCs/>
-        </w:rPr>
-        <w:t>Deskripsi Topik</w:t>
-      </w:r>
-      <w:r>
-        <w:t xml:space="preserve">, serta </w:t>
-      </w:r>
-      <w:r>
-        <w:rPr>
-          <w:b/>
-          <w:bCs/>
-        </w:rPr>
-        <w:t>Biaya/Harga</w:t>
-      </w:r>
-      <w:r>
-        <w:t xml:space="preserve"> dari lembaga penyedia pelatihan.</w:t>
+        <w:t>Penyiapan Sumber Data (Google Sheets):</w:t>
+      </w:r>
+    </w:p>
+    <w:p>
+      <w:pPr>
+        <w:pStyle w:val="NormalWeb"/>
+        <w:ind w:left="720"/>
+      </w:pPr>
+      <w:r>
+        <w:t xml:space="preserve">Sumber data utama menggunakan spreadsheet Google Sheets yang memuat direktori produk pelatihan. Data dikelompokkan ke dalam beberapa kolom utama, meliputi: </w:t>
       </w:r>
     </w:p>
     <w:p>
@@ -719,16 +719,21 @@
           <w:ilvl w:val="0"/>
           <w:numId w:val="12"/>
         </w:numPr>
+        <w:tabs>
+          <w:tab w:val="clear" w:pos="720"/>
+          <w:tab w:val="num" w:pos="1440"/>
+        </w:tabs>
+        <w:ind w:left="1440"/>
       </w:pPr>
       <w:r>
         <w:rPr>
           <w:b/>
           <w:bCs/>
         </w:rPr>
-        <w:t>Sumber Data</w:t>
-      </w:r>
-      <w:r>
-        <w:t>: Menggunakan salinan Google Sheets yang memuat daftar produk pelatihan (</w:t>
+        <w:t>Program Pelatihan:</w:t>
+      </w:r>
+      <w:r>
+        <w:t xml:space="preserve"> Kategori program (seperti </w:t>
       </w:r>
       <w:r>
         <w:rPr>
@@ -738,7 +743,7 @@
         <w:t>Bootcamp</w:t>
       </w:r>
       <w:r>
-        <w:t xml:space="preserve"> dan </w:t>
+        <w:t xml:space="preserve"> atau </w:t>
       </w:r>
       <w:r>
         <w:rPr>
@@ -748,7 +753,109 @@
         <w:t>Skill Up</w:t>
       </w:r>
       <w:r>
-        <w:t>) berserta rincian harga dan topik pembahasan.</w:t>
+        <w:t xml:space="preserve">). </w:t>
+      </w:r>
+    </w:p>
+    <w:p>
+      <w:pPr>
+        <w:pStyle w:val="NormalWeb"/>
+        <w:numPr>
+          <w:ilvl w:val="0"/>
+          <w:numId w:val="12"/>
+        </w:numPr>
+        <w:tabs>
+          <w:tab w:val="clear" w:pos="720"/>
+          <w:tab w:val="num" w:pos="1440"/>
+        </w:tabs>
+        <w:ind w:left="1440"/>
+      </w:pPr>
+      <w:r>
+        <w:rPr>
+          <w:b/>
+          <w:bCs/>
+        </w:rPr>
+        <w:t>Nama Pelatihan/Kursus:</w:t>
+      </w:r>
+      <w:r>
+        <w:t xml:space="preserve"> Judul spesifik bidang studi (seperti </w:t>
+      </w:r>
+      <w:r>
+        <w:rPr>
+          <w:i/>
+          <w:iCs/>
+        </w:rPr>
+        <w:t>Digital Marketing</w:t>
+      </w:r>
+      <w:r>
+        <w:t xml:space="preserve">, </w:t>
+      </w:r>
+      <w:r>
+        <w:rPr>
+          <w:i/>
+          <w:iCs/>
+        </w:rPr>
+        <w:t>Network Engineering</w:t>
+      </w:r>
+      <w:r>
+        <w:t xml:space="preserve">, </w:t>
+      </w:r>
+      <w:r>
+        <w:rPr>
+          <w:i/>
+          <w:iCs/>
+        </w:rPr>
+        <w:t>Cyber Security</w:t>
+      </w:r>
+      <w:r>
+        <w:t xml:space="preserve">, dll.). </w:t>
+      </w:r>
+    </w:p>
+    <w:p>
+      <w:pPr>
+        <w:pStyle w:val="NormalWeb"/>
+        <w:numPr>
+          <w:ilvl w:val="0"/>
+          <w:numId w:val="12"/>
+        </w:numPr>
+        <w:tabs>
+          <w:tab w:val="clear" w:pos="720"/>
+          <w:tab w:val="num" w:pos="1440"/>
+        </w:tabs>
+        <w:ind w:left="1440"/>
+      </w:pPr>
+      <w:r>
+        <w:rPr>
+          <w:b/>
+          <w:bCs/>
+        </w:rPr>
+        <w:t>Deskripsi Topik Pelatihan/Kursus:</w:t>
+      </w:r>
+      <w:r>
+        <w:t xml:space="preserve"> Silabus atau poin-poin materi yang dipelajari. </w:t>
+      </w:r>
+    </w:p>
+    <w:p>
+      <w:pPr>
+        <w:pStyle w:val="NormalWeb"/>
+        <w:numPr>
+          <w:ilvl w:val="0"/>
+          <w:numId w:val="12"/>
+        </w:numPr>
+        <w:tabs>
+          <w:tab w:val="clear" w:pos="720"/>
+          <w:tab w:val="num" w:pos="1440"/>
+        </w:tabs>
+        <w:ind w:left="1440"/>
+      </w:pPr>
+      <w:r>
+        <w:rPr>
+          <w:b/>
+          <w:bCs/>
+        </w:rPr>
+        <w:t>Biaya atau Harga:</w:t>
+      </w:r>
+      <w:r>
+        <w:t xml:space="preserve"> Tarif investasi pelatihan dalam mata uang Rupiah (IDR). </w:t>
       </w:r>
     </w:p>
     <w:p>
@@ -756,18 +863,11 @@
         <w:pStyle w:val="NormalWeb"/>
         <w:spacing w:after="0" w:afterAutospacing="0"/>
         <w:jc w:val="center"/>
-        <w:rPr>
-          <w:rFonts w:ascii="Segoe UI Emoji" w:hAnsi="Segoe UI Emoji" w:cs="Segoe UI Emoji"/>
-        </w:rPr>
-      </w:pPr>
-      <w:r>
-        <w:rPr>
-          <w:rFonts w:ascii="Segoe UI Emoji" w:hAnsi="Segoe UI Emoji" w:cs="Segoe UI Emoji"/>
-          <w:noProof/>
-        </w:rPr>
+      </w:pPr>
+      <w:r>
         <w:drawing>
-          <wp:inline distT="0" distB="0" distL="0" distR="0" wp14:anchorId="27B137B2" wp14:editId="136E4B25">
-            <wp:extent cx="4882836" cy="2497414"/>
+          <wp:inline distT="0" distB="0" distL="0" distR="0" wp14:anchorId="70220FC9" wp14:editId="3384B143">
+            <wp:extent cx="4768850" cy="3963033"/>
             <wp:effectExtent l="0" t="0" r="0" b="0"/>
             <wp:docPr id="1" name="Picture 1"/>
             <wp:cNvGraphicFramePr>
@@ -789,7 +889,7 @@
                   <pic:spPr>
                     <a:xfrm>
                       <a:off x="0" y="0"/>
-                      <a:ext cx="4906595" cy="2509566"/>
+                      <a:ext cx="4799594" cy="3988582"/>
                     </a:xfrm>
                     <a:prstGeom prst="rect">
                       <a:avLst/>
@@ -833,6 +933,7 @@
           <w:i/>
           <w:iCs/>
         </w:rPr>
+        <w:lastRenderedPageBreak/>
         <w:t>Langkah 2: Konfigurasi Trigger Input (</w:t>
       </w:r>
       <w:r>
@@ -850,6 +951,87 @@
           <w:iCs/>
         </w:rPr>
         <w:t>)</w:t>
+      </w:r>
+    </w:p>
+    <w:p>
+      <w:pPr>
+        <w:pStyle w:val="NormalWeb"/>
+        <w:ind w:left="720"/>
+      </w:pPr>
+      <w:r>
+        <w:t xml:space="preserve">  </w:t>
+      </w:r>
+      <w:r>
+        <w:rPr>
+          <w:b/>
+          <w:bCs/>
+        </w:rPr>
+        <w:t>Inisialisasi Node Trigger:</w:t>
+      </w:r>
+    </w:p>
+    <w:p>
+      <w:pPr>
+        <w:pStyle w:val="NormalWeb"/>
+        <w:ind w:left="720"/>
+      </w:pPr>
+      <w:r>
+        <w:t>Alur kerja (</w:t>
+      </w:r>
+      <w:r>
+        <w:rPr>
+          <w:i/>
+          <w:iCs/>
+        </w:rPr>
+        <w:t>workflow</w:t>
+      </w:r>
+      <w:r>
+        <w:t xml:space="preserve">) dimulai dengan menambahkan node trigger bertipe </w:t>
+      </w:r>
+      <w:r>
+        <w:rPr>
+          <w:rStyle w:val="HTMLCode"/>
+          <w:rFonts w:ascii="Times New Roman" w:hAnsi="Times New Roman" w:cs="Times New Roman"/>
+        </w:rPr>
+        <w:t>@n8n/n8n-nodes-langchain.chatTrigger</w:t>
+      </w:r>
+      <w:r>
+        <w:t>. Node ini bertindak sebagai pintu masuk utama (</w:t>
+      </w:r>
+      <w:r>
+        <w:rPr>
+          <w:i/>
+          <w:iCs/>
+        </w:rPr>
+        <w:t>entry point</w:t>
+      </w:r>
+      <w:r>
+        <w:t>) yang menangkap setiap pesan masuk dari pengguna (</w:t>
+      </w:r>
+      <w:r>
+        <w:rPr>
+          <w:i/>
+          <w:iCs/>
+        </w:rPr>
+        <w:t>user input</w:t>
+      </w:r>
+      <w:r>
+        <w:t xml:space="preserve">). </w:t>
+      </w:r>
+    </w:p>
+    <w:p>
+      <w:pPr>
+        <w:pStyle w:val="NormalWeb"/>
+        <w:ind w:left="720"/>
+      </w:pPr>
+      <w:r>
+        <w:t xml:space="preserve">  </w:t>
+      </w:r>
+      <w:r>
+        <w:rPr>
+          <w:b/>
+          <w:bCs/>
+        </w:rPr>
+        <w:t>Pengaturan Aksesibilitas dan Antarmuka (Public Webchat):</w:t>
       </w:r>
     </w:p>
     <w:p>
@@ -859,19 +1041,34 @@
           <w:ilvl w:val="0"/>
           <w:numId w:val="13"/>
         </w:numPr>
-      </w:pPr>
-      <w:r>
-        <w:t xml:space="preserve">Dibuat node trigger bertipe </w:t>
-      </w:r>
-      <w:r>
-        <w:rPr>
-          <w:rStyle w:val="HTMLCode"/>
-          <w:rFonts w:ascii="Times New Roman" w:eastAsiaTheme="majorEastAsia" w:hAnsi="Times New Roman" w:cs="Times New Roman"/>
-        </w:rPr>
-        <w:t>@n8n/n8n-nodes-langchain.chatTrigger</w:t>
-      </w:r>
-      <w:r>
-        <w:t>.</w:t>
+        <w:tabs>
+          <w:tab w:val="clear" w:pos="720"/>
+          <w:tab w:val="num" w:pos="1440"/>
+        </w:tabs>
+        <w:ind w:left="1440"/>
+      </w:pPr>
+      <w:r>
+        <w:t xml:space="preserve">Opsi </w:t>
+      </w:r>
+      <w:r>
+        <w:rPr>
+          <w:b/>
+          <w:bCs/>
+        </w:rPr>
+        <w:t>Make Chat Publicly Available</w:t>
+      </w:r>
+      <w:r>
+        <w:t xml:space="preserve"> diaktifkan agar antarmuka obrolan dapat diakses secara umum oleh publik melalui tautan URL khusus (</w:t>
+      </w:r>
+      <w:r>
+        <w:rPr>
+          <w:i/>
+          <w:iCs/>
+        </w:rPr>
+        <w:t>Hosted Chat</w:t>
+      </w:r>
+      <w:r>
+        <w:t xml:space="preserve">). </w:t>
       </w:r>
     </w:p>
     <w:p>
@@ -881,30 +1078,112 @@
           <w:ilvl w:val="0"/>
           <w:numId w:val="13"/>
         </w:numPr>
-      </w:pPr>
-      <w:r>
-        <w:t>Dikonfigurasi agar dapat diakses secara publik (</w:t>
-      </w:r>
+        <w:tabs>
+          <w:tab w:val="clear" w:pos="720"/>
+          <w:tab w:val="num" w:pos="1440"/>
+        </w:tabs>
+        <w:ind w:left="1440"/>
+      </w:pPr>
       <w:r>
         <w:rPr>
           <w:b/>
           <w:bCs/>
         </w:rPr>
-        <w:t>Public Webchat</w:t>
-      </w:r>
-      <w:r>
-        <w:t xml:space="preserve">) dan diberikan judul antarmuka </w:t>
+        <w:t>Authentication</w:t>
+      </w:r>
+      <w:r>
+        <w:t xml:space="preserve"> diset ke </w:t>
       </w:r>
       <w:r>
         <w:rPr>
           <w:i/>
           <w:iCs/>
         </w:rPr>
-        <w:t>"Asisten Layanan Informasi Produk &amp; Harga Pelatihan"</w:t>
-      </w:r>
-      <w:r>
-        <w:t>.</w:t>
-      </w:r>
+        <w:t>None</w:t>
+      </w:r>
+      <w:r>
+        <w:t xml:space="preserve"> untuk memudahkan aksesibilitas bagi pengguna tanpa perlunya proses login tambahan. </w:t>
+      </w:r>
+    </w:p>
+    <w:p>
+      <w:pPr>
+        <w:pStyle w:val="NormalWeb"/>
+        <w:numPr>
+          <w:ilvl w:val="0"/>
+          <w:numId w:val="13"/>
+        </w:numPr>
+        <w:tabs>
+          <w:tab w:val="clear" w:pos="720"/>
+          <w:tab w:val="num" w:pos="1440"/>
+        </w:tabs>
+        <w:ind w:left="1440"/>
+      </w:pPr>
+      <w:r>
+        <w:t>Konfigurasi judul antarmuka (</w:t>
+      </w:r>
+      <w:r>
+        <w:rPr>
+          <w:i/>
+          <w:iCs/>
+        </w:rPr>
+        <w:t>Title</w:t>
+      </w:r>
+      <w:r>
+        <w:t xml:space="preserve">) disesuaikan menjadi </w:t>
+      </w:r>
+      <w:r>
+        <w:rPr>
+          <w:b/>
+          <w:bCs/>
+        </w:rPr>
+        <w:t>"Chatbot Informasi Pelatihan &amp; Harga"</w:t>
+      </w:r>
+      <w:r>
+        <w:t xml:space="preserve">. </w:t>
+      </w:r>
+    </w:p>
+    <w:p>
+      <w:pPr>
+        <w:pStyle w:val="NormalWeb"/>
+        <w:numPr>
+          <w:ilvl w:val="0"/>
+          <w:numId w:val="13"/>
+        </w:numPr>
+        <w:tabs>
+          <w:tab w:val="clear" w:pos="720"/>
+          <w:tab w:val="num" w:pos="1440"/>
+        </w:tabs>
+        <w:ind w:left="1440"/>
+      </w:pPr>
+      <w:r>
+        <w:t>Ditambahkan pula pesan sapaan awal (</w:t>
+      </w:r>
+      <w:r>
+        <w:rPr>
+          <w:i/>
+          <w:iCs/>
+        </w:rPr>
+        <w:t>Initial Message</w:t>
+      </w:r>
+      <w:r>
+        <w:t xml:space="preserve">) untuk menyambut pengguna secara ramah: </w:t>
+      </w:r>
+      <w:r>
+        <w:rPr>
+          <w:i/>
+          <w:iCs/>
+        </w:rPr>
+        <w:t>"Halo! Selamat datang di Layanan Informasi Pelatihan. Ada yang bisa saya bantu terkait produk pelatihan dan harganya?"</w:t>
+      </w:r>
+      <w:r>
+        <w:t xml:space="preserve">. </w:t>
+      </w:r>
+    </w:p>
+    <w:p>
+      <w:pPr>
+        <w:pStyle w:val="NormalWeb"/>
+        <w:ind w:left="720"/>
+      </w:pPr>
     </w:p>
     <w:p>
       <w:pPr>
@@ -991,7 +1270,6 @@
           <w:rFonts w:ascii="Times New Roman" w:hAnsi="Times New Roman" w:cs="Times New Roman"/>
           <w:color w:val="auto"/>
         </w:rPr>
-        <w:lastRenderedPageBreak/>
         <w:t>Langkah 3: Konfigurasi Sub-node AI Model (</w:t>
       </w:r>
       <w:r>
@@ -1012,59 +1290,222 @@
     </w:p>
     <w:p>
       <w:pPr>
-        <w:pStyle w:val="NormalWeb"/>
+        <w:pStyle w:val="ListParagraph"/>
         <w:numPr>
           <w:ilvl w:val="0"/>
           <w:numId w:val="14"/>
         </w:numPr>
-      </w:pPr>
-      <w:r>
-        <w:t xml:space="preserve">Menggunakan sub-node </w:t>
-      </w:r>
-      <w:r>
-        <w:rPr>
-          <w:rStyle w:val="HTMLCode"/>
-          <w:rFonts w:ascii="Times New Roman" w:eastAsiaTheme="majorEastAsia" w:hAnsi="Times New Roman" w:cs="Times New Roman"/>
+        <w:spacing w:before="100" w:beforeAutospacing="1" w:after="100" w:afterAutospacing="1" w:line="240" w:lineRule="auto"/>
+        <w:rPr>
+          <w:rFonts w:ascii="Times New Roman" w:eastAsia="Times New Roman" w:hAnsi="Times New Roman" w:cs="Times New Roman"/>
+          <w:color w:val="auto"/>
+          <w:sz w:val="24"/>
+          <w:szCs w:val="24"/>
+        </w:rPr>
+      </w:pPr>
+      <w:r>
+        <w:rPr>
+          <w:rFonts w:ascii="Times New Roman" w:eastAsia="Times New Roman" w:hAnsi="Times New Roman" w:cs="Times New Roman"/>
+          <w:b/>
+          <w:bCs/>
+          <w:color w:val="auto"/>
+          <w:sz w:val="24"/>
+          <w:szCs w:val="24"/>
+        </w:rPr>
+        <w:t>Pemilihan Model Bahasa (LLM):</w:t>
+      </w:r>
+    </w:p>
+    <w:p>
+      <w:pPr>
+        <w:pStyle w:val="ListParagraph"/>
+        <w:spacing w:before="100" w:beforeAutospacing="1" w:after="100" w:afterAutospacing="1" w:line="240" w:lineRule="auto"/>
+        <w:rPr>
+          <w:rFonts w:ascii="Times New Roman" w:eastAsia="Times New Roman" w:hAnsi="Times New Roman" w:cs="Times New Roman"/>
+          <w:color w:val="auto"/>
+          <w:sz w:val="24"/>
+          <w:szCs w:val="24"/>
+        </w:rPr>
+      </w:pPr>
+      <w:r>
+        <w:rPr>
+          <w:rFonts w:ascii="Times New Roman" w:eastAsia="Times New Roman" w:hAnsi="Times New Roman" w:cs="Times New Roman"/>
+          <w:color w:val="auto"/>
+          <w:sz w:val="24"/>
+          <w:szCs w:val="24"/>
+        </w:rPr>
+        <w:t>Guna memproses pemahaman bahasa alami (</w:t>
+      </w:r>
+      <w:r>
+        <w:rPr>
+          <w:rFonts w:ascii="Times New Roman" w:eastAsia="Times New Roman" w:hAnsi="Times New Roman" w:cs="Times New Roman"/>
+          <w:i/>
+          <w:iCs/>
+          <w:color w:val="auto"/>
+          <w:sz w:val="24"/>
+          <w:szCs w:val="24"/>
+        </w:rPr>
+        <w:t>Natural Language Processing</w:t>
+      </w:r>
+      <w:r>
+        <w:rPr>
+          <w:rFonts w:ascii="Times New Roman" w:eastAsia="Times New Roman" w:hAnsi="Times New Roman" w:cs="Times New Roman"/>
+          <w:color w:val="auto"/>
+          <w:sz w:val="24"/>
+          <w:szCs w:val="24"/>
+        </w:rPr>
+        <w:t xml:space="preserve">), dihubungkan sub-node </w:t>
+      </w:r>
+      <w:r>
+        <w:rPr>
+          <w:rFonts w:ascii="Times New Roman" w:eastAsia="Times New Roman" w:hAnsi="Times New Roman" w:cs="Times New Roman"/>
+          <w:color w:val="auto"/>
+          <w:sz w:val="20"/>
+          <w:szCs w:val="20"/>
         </w:rPr>
         <w:t>@n8n/n8n-nodes-langchain.lmChatGoogleGemini</w:t>
       </w:r>
       <w:r>
-        <w:t>.</w:t>
-      </w:r>
-    </w:p>
-    <w:p>
-      <w:pPr>
-        <w:pStyle w:val="NormalWeb"/>
+        <w:rPr>
+          <w:rFonts w:ascii="Times New Roman" w:eastAsia="Times New Roman" w:hAnsi="Times New Roman" w:cs="Times New Roman"/>
+          <w:color w:val="auto"/>
+          <w:sz w:val="24"/>
+          <w:szCs w:val="24"/>
+        </w:rPr>
+        <w:t xml:space="preserve">. Model yang dipilih adalah </w:t>
+      </w:r>
+      <w:r>
+        <w:rPr>
+          <w:rFonts w:ascii="Times New Roman" w:eastAsia="Times New Roman" w:hAnsi="Times New Roman" w:cs="Times New Roman"/>
+          <w:color w:val="auto"/>
+          <w:sz w:val="20"/>
+          <w:szCs w:val="20"/>
+        </w:rPr>
+        <w:t>models/gemini-1.5-flash</w:t>
+      </w:r>
+      <w:r>
+        <w:rPr>
+          <w:rFonts w:ascii="Times New Roman" w:eastAsia="Times New Roman" w:hAnsi="Times New Roman" w:cs="Times New Roman"/>
+          <w:color w:val="auto"/>
+          <w:sz w:val="24"/>
+          <w:szCs w:val="24"/>
+        </w:rPr>
+        <w:t xml:space="preserve">, yang menawarkan efisiensi tinggi, kecepatan respons yang optimal, serta mendukung kapabilitas </w:t>
+      </w:r>
+      <w:r>
+        <w:rPr>
+          <w:rFonts w:ascii="Times New Roman" w:eastAsia="Times New Roman" w:hAnsi="Times New Roman" w:cs="Times New Roman"/>
+          <w:i/>
+          <w:iCs/>
+          <w:color w:val="auto"/>
+          <w:sz w:val="24"/>
+          <w:szCs w:val="24"/>
+        </w:rPr>
+        <w:t>Tool/Function Calling</w:t>
+      </w:r>
+      <w:r>
+        <w:rPr>
+          <w:rFonts w:ascii="Times New Roman" w:eastAsia="Times New Roman" w:hAnsi="Times New Roman" w:cs="Times New Roman"/>
+          <w:color w:val="auto"/>
+          <w:sz w:val="24"/>
+          <w:szCs w:val="24"/>
+        </w:rPr>
+        <w:t xml:space="preserve"> dengan sangat baik. </w:t>
+      </w:r>
+    </w:p>
+    <w:p>
+      <w:pPr>
+        <w:pStyle w:val="ListParagraph"/>
         <w:numPr>
           <w:ilvl w:val="0"/>
           <w:numId w:val="14"/>
         </w:numPr>
-      </w:pPr>
-      <w:r>
-        <w:t xml:space="preserve">Model yang digunakan adalah </w:t>
-      </w:r>
-      <w:r>
-        <w:rPr>
-          <w:rStyle w:val="HTMLCode"/>
-          <w:rFonts w:ascii="Times New Roman" w:eastAsiaTheme="majorEastAsia" w:hAnsi="Times New Roman" w:cs="Times New Roman"/>
-        </w:rPr>
-        <w:t>models/gemini-1.5-flash</w:t>
-      </w:r>
-      <w:r>
-        <w:t>.</w:t>
+        <w:spacing w:before="100" w:beforeAutospacing="1" w:after="100" w:afterAutospacing="1" w:line="240" w:lineRule="auto"/>
+        <w:rPr>
+          <w:rFonts w:ascii="Times New Roman" w:eastAsia="Times New Roman" w:hAnsi="Times New Roman" w:cs="Times New Roman"/>
+          <w:color w:val="auto"/>
+          <w:sz w:val="24"/>
+          <w:szCs w:val="24"/>
+        </w:rPr>
+      </w:pPr>
+      <w:r>
+        <w:rPr>
+          <w:rFonts w:ascii="Times New Roman" w:eastAsia="Times New Roman" w:hAnsi="Times New Roman" w:cs="Times New Roman"/>
+          <w:b/>
+          <w:bCs/>
+          <w:color w:val="auto"/>
+          <w:sz w:val="24"/>
+          <w:szCs w:val="24"/>
+        </w:rPr>
+        <w:t>Autentikasi Kredensial API:</w:t>
+      </w:r>
+    </w:p>
+    <w:p>
+      <w:pPr>
+        <w:pStyle w:val="ListParagraph"/>
+        <w:spacing w:before="100" w:beforeAutospacing="1" w:after="100" w:afterAutospacing="1" w:line="240" w:lineRule="auto"/>
+        <w:rPr>
+          <w:rFonts w:ascii="Times New Roman" w:eastAsia="Times New Roman" w:hAnsi="Times New Roman" w:cs="Times New Roman"/>
+          <w:color w:val="auto"/>
+          <w:sz w:val="24"/>
+          <w:szCs w:val="24"/>
+        </w:rPr>
+      </w:pPr>
+      <w:r>
+        <w:rPr>
+          <w:rFonts w:ascii="Times New Roman" w:eastAsia="Times New Roman" w:hAnsi="Times New Roman" w:cs="Times New Roman"/>
+          <w:color w:val="auto"/>
+          <w:sz w:val="24"/>
+          <w:szCs w:val="24"/>
+        </w:rPr>
+        <w:lastRenderedPageBreak/>
+        <w:t xml:space="preserve">Sistem dihubungkan ke layanan Google AI Studio menggunakan </w:t>
+      </w:r>
+      <w:r>
+        <w:rPr>
+          <w:rFonts w:ascii="Times New Roman" w:eastAsia="Times New Roman" w:hAnsi="Times New Roman" w:cs="Times New Roman"/>
+          <w:i/>
+          <w:iCs/>
+          <w:color w:val="auto"/>
+          <w:sz w:val="24"/>
+          <w:szCs w:val="24"/>
+        </w:rPr>
+        <w:t>Google Gemini API Key</w:t>
+      </w:r>
+      <w:r>
+        <w:rPr>
+          <w:rFonts w:ascii="Times New Roman" w:eastAsia="Times New Roman" w:hAnsi="Times New Roman" w:cs="Times New Roman"/>
+          <w:color w:val="auto"/>
+          <w:sz w:val="24"/>
+          <w:szCs w:val="24"/>
+        </w:rPr>
+        <w:t xml:space="preserve"> yang telah dikonfigurasi pada akun kredensial n8n. Verifikasi koneksi (</w:t>
+      </w:r>
+      <w:r>
+        <w:rPr>
+          <w:rFonts w:ascii="Times New Roman" w:eastAsia="Times New Roman" w:hAnsi="Times New Roman" w:cs="Times New Roman"/>
+          <w:i/>
+          <w:iCs/>
+          <w:color w:val="auto"/>
+          <w:sz w:val="24"/>
+          <w:szCs w:val="24"/>
+        </w:rPr>
+        <w:t>Connection tested successfully</w:t>
+      </w:r>
+      <w:r>
+        <w:rPr>
+          <w:rFonts w:ascii="Times New Roman" w:eastAsia="Times New Roman" w:hAnsi="Times New Roman" w:cs="Times New Roman"/>
+          <w:color w:val="auto"/>
+          <w:sz w:val="24"/>
+          <w:szCs w:val="24"/>
+        </w:rPr>
+        <w:t xml:space="preserve">) berhasil dilakukan untuk memastikan n8n dapat berkomunikasi dengan server Google Gemini secara aman. </w:t>
       </w:r>
     </w:p>
     <w:p>
       <w:pPr>
         <w:pStyle w:val="NormalWeb"/>
-        <w:numPr>
-          <w:ilvl w:val="0"/>
-          <w:numId w:val="14"/>
-        </w:numPr>
-      </w:pPr>
-      <w:r>
-        <w:t>Kredensial dihubungkan dengan Google Gemini API Key yang telah dibuat pada Google AI Studio.</w:t>
-      </w:r>
+        <w:ind w:left="720"/>
+      </w:pPr>
     </w:p>
     <w:p>
       <w:pPr>
@@ -1082,9 +1523,9 @@
           <w:noProof/>
         </w:rPr>
         <w:drawing>
-          <wp:inline distT="0" distB="0" distL="0" distR="0" wp14:anchorId="553FE0B2" wp14:editId="15A8A490">
-            <wp:extent cx="3092101" cy="3043792"/>
-            <wp:effectExtent l="0" t="0" r="0" b="4445"/>
+          <wp:inline distT="0" distB="0" distL="0" distR="0" wp14:anchorId="553FE0B2" wp14:editId="7B51CCF7">
+            <wp:extent cx="3880145" cy="3819525"/>
+            <wp:effectExtent l="0" t="0" r="6350" b="0"/>
             <wp:docPr id="3" name="Picture 3"/>
             <wp:cNvGraphicFramePr>
               <a:graphicFrameLocks xmlns:a="http://schemas.openxmlformats.org/drawingml/2006/main" noChangeAspect="1"/>
@@ -1105,7 +1546,7 @@
                   <pic:spPr>
                     <a:xfrm>
                       <a:off x="0" y="0"/>
-                      <a:ext cx="3121421" cy="3072654"/>
+                      <a:ext cx="3933244" cy="3871794"/>
                     </a:xfrm>
                     <a:prstGeom prst="rect">
                       <a:avLst/>
@@ -1155,47 +1596,163 @@
     </w:p>
     <w:p>
       <w:pPr>
-        <w:pStyle w:val="NormalWeb"/>
+        <w:pStyle w:val="ListParagraph"/>
         <w:numPr>
           <w:ilvl w:val="0"/>
           <w:numId w:val="15"/>
         </w:numPr>
-      </w:pPr>
-      <w:r>
-        <w:t xml:space="preserve">Menggunakan sub-node </w:t>
-      </w:r>
-      <w:r>
-        <w:rPr>
-          <w:rStyle w:val="HTMLCode"/>
-          <w:rFonts w:ascii="Times New Roman" w:eastAsiaTheme="majorEastAsia" w:hAnsi="Times New Roman" w:cs="Times New Roman"/>
+        <w:spacing w:before="100" w:beforeAutospacing="1" w:after="100" w:afterAutospacing="1" w:line="240" w:lineRule="auto"/>
+        <w:rPr>
+          <w:rFonts w:ascii="Times New Roman" w:eastAsia="Times New Roman" w:hAnsi="Times New Roman" w:cs="Times New Roman"/>
+          <w:color w:val="auto"/>
+          <w:sz w:val="24"/>
+          <w:szCs w:val="24"/>
+        </w:rPr>
+      </w:pPr>
+      <w:r>
+        <w:rPr>
+          <w:rFonts w:ascii="Times New Roman" w:eastAsia="Times New Roman" w:hAnsi="Times New Roman" w:cs="Times New Roman"/>
+          <w:b/>
+          <w:bCs/>
+          <w:color w:val="auto"/>
+          <w:sz w:val="24"/>
+          <w:szCs w:val="24"/>
+        </w:rPr>
+        <w:t>Manajemen Konteks Percakapan:</w:t>
+      </w:r>
+    </w:p>
+    <w:p>
+      <w:pPr>
+        <w:pStyle w:val="ListParagraph"/>
+        <w:spacing w:before="100" w:beforeAutospacing="1" w:after="100" w:afterAutospacing="1" w:line="240" w:lineRule="auto"/>
+        <w:rPr>
+          <w:rFonts w:ascii="Times New Roman" w:eastAsia="Times New Roman" w:hAnsi="Times New Roman" w:cs="Times New Roman"/>
+          <w:color w:val="auto"/>
+          <w:sz w:val="24"/>
+          <w:szCs w:val="24"/>
+        </w:rPr>
+      </w:pPr>
+      <w:r>
+        <w:rPr>
+          <w:rFonts w:ascii="Times New Roman" w:eastAsia="Times New Roman" w:hAnsi="Times New Roman" w:cs="Times New Roman"/>
+          <w:color w:val="auto"/>
+          <w:sz w:val="24"/>
+          <w:szCs w:val="24"/>
+        </w:rPr>
+        <w:t xml:space="preserve">Untuk memastikan obrolan berjalan secara kontekstual dan berkelanjutan, digunakan sub-node </w:t>
+      </w:r>
+      <w:r>
+        <w:rPr>
+          <w:rFonts w:ascii="Times New Roman" w:eastAsia="Times New Roman" w:hAnsi="Times New Roman" w:cs="Times New Roman"/>
+          <w:color w:val="auto"/>
+          <w:sz w:val="20"/>
+          <w:szCs w:val="20"/>
         </w:rPr>
         <w:t>@n8n/n8n-nodes-langchain.memoryBufferWindow</w:t>
       </w:r>
       <w:r>
-        <w:t>.</w:t>
-      </w:r>
-    </w:p>
-    <w:p>
-      <w:pPr>
-        <w:pStyle w:val="NormalWeb"/>
+        <w:rPr>
+          <w:rFonts w:ascii="Times New Roman" w:eastAsia="Times New Roman" w:hAnsi="Times New Roman" w:cs="Times New Roman"/>
+          <w:color w:val="auto"/>
+          <w:sz w:val="24"/>
+          <w:szCs w:val="24"/>
+        </w:rPr>
+        <w:t xml:space="preserve">. </w:t>
+      </w:r>
+    </w:p>
+    <w:p>
+      <w:pPr>
+        <w:pStyle w:val="ListParagraph"/>
         <w:numPr>
           <w:ilvl w:val="0"/>
           <w:numId w:val="15"/>
         </w:numPr>
-      </w:pPr>
-      <w:r>
-        <w:t xml:space="preserve">Kapasitas memory diatur dengan </w:t>
-      </w:r>
-      <w:r>
-        <w:rPr>
-          <w:rStyle w:val="HTMLCode"/>
-          <w:rFonts w:ascii="Times New Roman" w:eastAsiaTheme="majorEastAsia" w:hAnsi="Times New Roman" w:cs="Times New Roman"/>
-        </w:rPr>
-        <w:t>Context Window Length = 5</w:t>
-      </w:r>
-      <w:r>
-        <w:t xml:space="preserve"> untuk menyimpan 5 percakapan terakhir agar percakapan berlangsung secara kontekstual.</w:t>
-      </w:r>
+        <w:spacing w:before="100" w:beforeAutospacing="1" w:after="100" w:afterAutospacing="1" w:line="240" w:lineRule="auto"/>
+        <w:rPr>
+          <w:rFonts w:ascii="Times New Roman" w:eastAsia="Times New Roman" w:hAnsi="Times New Roman" w:cs="Times New Roman"/>
+          <w:color w:val="auto"/>
+          <w:sz w:val="24"/>
+          <w:szCs w:val="24"/>
+        </w:rPr>
+      </w:pPr>
+      <w:r>
+        <w:rPr>
+          <w:rFonts w:ascii="Times New Roman" w:eastAsia="Times New Roman" w:hAnsi="Times New Roman" w:cs="Times New Roman"/>
+          <w:b/>
+          <w:bCs/>
+          <w:color w:val="auto"/>
+          <w:sz w:val="24"/>
+          <w:szCs w:val="24"/>
+        </w:rPr>
+        <w:t>Pengaturan Context Window:</w:t>
+      </w:r>
+    </w:p>
+    <w:p>
+      <w:pPr>
+        <w:pStyle w:val="ListParagraph"/>
+        <w:spacing w:before="100" w:beforeAutospacing="1" w:after="100" w:afterAutospacing="1" w:line="240" w:lineRule="auto"/>
+        <w:rPr>
+          <w:rFonts w:ascii="Times New Roman" w:eastAsia="Times New Roman" w:hAnsi="Times New Roman" w:cs="Times New Roman"/>
+          <w:color w:val="auto"/>
+          <w:sz w:val="24"/>
+          <w:szCs w:val="24"/>
+        </w:rPr>
+      </w:pPr>
+      <w:r>
+        <w:rPr>
+          <w:rFonts w:ascii="Times New Roman" w:eastAsia="Times New Roman" w:hAnsi="Times New Roman" w:cs="Times New Roman"/>
+          <w:color w:val="auto"/>
+          <w:sz w:val="24"/>
+          <w:szCs w:val="24"/>
+        </w:rPr>
+        <w:t xml:space="preserve">Parameter </w:t>
+      </w:r>
+      <w:r>
+        <w:rPr>
+          <w:rFonts w:ascii="Times New Roman" w:eastAsia="Times New Roman" w:hAnsi="Times New Roman" w:cs="Times New Roman"/>
+          <w:b/>
+          <w:bCs/>
+          <w:color w:val="auto"/>
+          <w:sz w:val="24"/>
+          <w:szCs w:val="24"/>
+        </w:rPr>
+        <w:t>Context Window Length</w:t>
+      </w:r>
+      <w:r>
+        <w:rPr>
+          <w:rFonts w:ascii="Times New Roman" w:eastAsia="Times New Roman" w:hAnsi="Times New Roman" w:cs="Times New Roman"/>
+          <w:color w:val="auto"/>
+          <w:sz w:val="24"/>
+          <w:szCs w:val="24"/>
+        </w:rPr>
+        <w:t xml:space="preserve"> diatur pada nilai </w:t>
+      </w:r>
+      <w:r>
+        <w:rPr>
+          <w:rFonts w:ascii="Times New Roman" w:eastAsia="Times New Roman" w:hAnsi="Times New Roman" w:cs="Times New Roman"/>
+          <w:b/>
+          <w:bCs/>
+          <w:color w:val="auto"/>
+          <w:sz w:val="24"/>
+          <w:szCs w:val="24"/>
+        </w:rPr>
+        <w:t>5</w:t>
+      </w:r>
+      <w:r>
+        <w:rPr>
+          <w:rFonts w:ascii="Times New Roman" w:eastAsia="Times New Roman" w:hAnsi="Times New Roman" w:cs="Times New Roman"/>
+          <w:color w:val="auto"/>
+          <w:sz w:val="24"/>
+          <w:szCs w:val="24"/>
+        </w:rPr>
+        <w:t>. Hal ini memungkinkan AI Agent untuk mengingat hingga 5 riwayat pertukaran pesan terakhir (interaksi tanya-jawab sebelumnya). Dengan adanya memori ini, pengguna tidak perlu mengulang konteks atau topik yang sedang dibahas pada riwayat obrolan sebelumnya.</w:t>
+      </w:r>
+    </w:p>
+    <w:p>
+      <w:pPr>
+        <w:pStyle w:val="NormalWeb"/>
+        <w:ind w:left="720"/>
+      </w:pPr>
     </w:p>
     <w:p>
       <w:pPr>
@@ -1297,23 +1854,62 @@
     <w:p>
       <w:pPr>
         <w:pStyle w:val="NormalWeb"/>
-        <w:numPr>
-          <w:ilvl w:val="0"/>
-          <w:numId w:val="16"/>
-        </w:numPr>
-      </w:pPr>
-      <w:r>
-        <w:t xml:space="preserve">Menggunakan sub-node </w:t>
+        <w:ind w:left="720"/>
+      </w:pPr>
+      <w:r>
+        <w:t xml:space="preserve">  </w:t>
+      </w:r>
+      <w:r>
+        <w:rPr>
+          <w:b/>
+          <w:bCs/>
+        </w:rPr>
+        <w:t>Integrasi Agen dengan Basis Data:</w:t>
+      </w:r>
+    </w:p>
+    <w:p>
+      <w:pPr>
+        <w:pStyle w:val="NormalWeb"/>
+        <w:ind w:left="720"/>
+      </w:pPr>
+      <w:r>
+        <w:t xml:space="preserve">Sub-node </w:t>
       </w:r>
       <w:r>
         <w:rPr>
           <w:rStyle w:val="HTMLCode"/>
-          <w:rFonts w:ascii="Times New Roman" w:eastAsiaTheme="majorEastAsia" w:hAnsi="Times New Roman" w:cs="Times New Roman"/>
+          <w:rFonts w:ascii="Times New Roman" w:hAnsi="Times New Roman" w:cs="Times New Roman"/>
         </w:rPr>
         <w:t>@n8n/n8n-nodes-langchain.toolGoogleSheets</w:t>
       </w:r>
       <w:r>
-        <w:t xml:space="preserve"> bertipe Tool AI Agent.</w:t>
+        <w:t xml:space="preserve"> ditambahkan sebagai alat bantu (</w:t>
+      </w:r>
+      <w:r>
+        <w:rPr>
+          <w:i/>
+          <w:iCs/>
+        </w:rPr>
+        <w:t>Tool</w:t>
+      </w:r>
+      <w:r>
+        <w:t xml:space="preserve">) bagi AI Agent untuk membaca data langsung dari spreadsheet. </w:t>
+      </w:r>
+    </w:p>
+    <w:p>
+      <w:pPr>
+        <w:pStyle w:val="NormalWeb"/>
+        <w:ind w:left="720"/>
+      </w:pPr>
+      <w:r>
+        <w:t xml:space="preserve">  </w:t>
+      </w:r>
+      <w:r>
+        <w:rPr>
+          <w:b/>
+          <w:bCs/>
+        </w:rPr>
+        <w:t>Spesifikasi Operasi dan Autentikasi:</w:t>
       </w:r>
     </w:p>
     <w:p>
@@ -1323,19 +1919,31 @@
           <w:ilvl w:val="0"/>
           <w:numId w:val="16"/>
         </w:numPr>
-      </w:pPr>
-      <w:r>
-        <w:t xml:space="preserve">Operation diatur ke </w:t>
+        <w:tabs>
+          <w:tab w:val="clear" w:pos="720"/>
+          <w:tab w:val="num" w:pos="1440"/>
+        </w:tabs>
+        <w:ind w:left="1440"/>
+      </w:pPr>
+      <w:r>
+        <w:rPr>
+          <w:b/>
+          <w:bCs/>
+        </w:rPr>
+        <w:t>Operation:</w:t>
+      </w:r>
+      <w:r>
+        <w:t xml:space="preserve"> Diatur pada mode </w:t>
       </w:r>
       <w:r>
         <w:rPr>
           <w:rStyle w:val="HTMLCode"/>
-          <w:rFonts w:ascii="Times New Roman" w:eastAsiaTheme="majorEastAsia" w:hAnsi="Times New Roman" w:cs="Times New Roman"/>
+          <w:rFonts w:ascii="Times New Roman" w:hAnsi="Times New Roman" w:cs="Times New Roman"/>
         </w:rPr>
         <w:t>Get Row(s)</w:t>
       </w:r>
       <w:r>
-        <w:t>.</w:t>
+        <w:t xml:space="preserve"> untuk mengambil baris-baris data produk pelatihan. </w:t>
       </w:r>
     </w:p>
     <w:p>
@@ -1345,20 +1953,99 @@
           <w:ilvl w:val="0"/>
           <w:numId w:val="16"/>
         </w:numPr>
-      </w:pPr>
-      <w:r>
-        <w:t xml:space="preserve">Dihubungkan menggunakan OAuth2 Google Account dan diarahkan ke URL spreadsheet serta nama sheet </w:t>
+        <w:tabs>
+          <w:tab w:val="clear" w:pos="720"/>
+          <w:tab w:val="num" w:pos="1440"/>
+        </w:tabs>
+        <w:ind w:left="1440"/>
+      </w:pPr>
+      <w:r>
+        <w:rPr>
+          <w:b/>
+          <w:bCs/>
+        </w:rPr>
+        <w:t>Credential:</w:t>
+      </w:r>
+      <w:r>
+        <w:t xml:space="preserve"> Dihubungkan menggunakan protokol OAuth2 (</w:t>
+      </w:r>
+      <w:r>
+        <w:rPr>
+          <w:i/>
+          <w:iCs/>
+        </w:rPr>
+        <w:t>Google Sheets OAuth2 API</w:t>
+      </w:r>
+      <w:r>
+        <w:t xml:space="preserve">). </w:t>
+      </w:r>
+    </w:p>
+    <w:p>
+      <w:pPr>
+        <w:pStyle w:val="NormalWeb"/>
+        <w:numPr>
+          <w:ilvl w:val="0"/>
+          <w:numId w:val="16"/>
+        </w:numPr>
+        <w:tabs>
+          <w:tab w:val="clear" w:pos="720"/>
+          <w:tab w:val="num" w:pos="1440"/>
+        </w:tabs>
+        <w:ind w:left="1440"/>
+      </w:pPr>
+      <w:r>
+        <w:rPr>
+          <w:b/>
+          <w:bCs/>
+        </w:rPr>
+        <w:t>Document &amp; Sheet Target:</w:t>
+      </w:r>
+      <w:r>
+        <w:t xml:space="preserve"> Diarahkan langsung menggunakan metode </w:t>
+      </w:r>
+      <w:r>
+        <w:rPr>
+          <w:i/>
+          <w:iCs/>
+        </w:rPr>
+        <w:t>By URL</w:t>
+      </w:r>
+      <w:r>
+        <w:t xml:space="preserve"> menuju tautan file Google Sheets spesifik, dengan penunjukan nama lembar kerja pada </w:t>
       </w:r>
       <w:r>
         <w:rPr>
           <w:rStyle w:val="HTMLCode"/>
-          <w:rFonts w:ascii="Times New Roman" w:eastAsiaTheme="majorEastAsia" w:hAnsi="Times New Roman" w:cs="Times New Roman"/>
+          <w:rFonts w:ascii="Times New Roman" w:hAnsi="Times New Roman" w:cs="Times New Roman"/>
         </w:rPr>
         <w:t>Sheet1</w:t>
       </w:r>
       <w:r>
-        <w:t>.</w:t>
-      </w:r>
+        <w:t xml:space="preserve">. </w:t>
+      </w:r>
+    </w:p>
+    <w:p>
+      <w:pPr>
+        <w:pStyle w:val="NormalWeb"/>
+        <w:numPr>
+          <w:ilvl w:val="0"/>
+          <w:numId w:val="16"/>
+        </w:numPr>
+        <w:tabs>
+          <w:tab w:val="clear" w:pos="720"/>
+          <w:tab w:val="num" w:pos="1440"/>
+        </w:tabs>
+        <w:ind w:left="1440"/>
+      </w:pPr>
+      <w:r>
+        <w:t xml:space="preserve">Melalui konfigurasi ini, AI Agent secara otomatis dapat menjalankan kueri data setiap kali menerima pertanyaan seputar produk atau harga. </w:t>
+      </w:r>
+    </w:p>
+    <w:p>
+      <w:pPr>
+        <w:pStyle w:val="NormalWeb"/>
+        <w:ind w:left="720"/>
+      </w:pPr>
     </w:p>
     <w:p>
       <w:pPr>
@@ -1375,6 +2062,7 @@
           <w:bCs/>
           <w:noProof/>
         </w:rPr>
+        <w:lastRenderedPageBreak/>
         <w:drawing>
           <wp:inline distT="0" distB="0" distL="0" distR="0" wp14:anchorId="19E0EAC3" wp14:editId="06F0742D">
             <wp:extent cx="3282950" cy="3234933"/>
@@ -1438,8 +2126,84 @@
           <w:rFonts w:ascii="Times New Roman" w:hAnsi="Times New Roman" w:cs="Times New Roman"/>
           <w:color w:val="auto"/>
         </w:rPr>
-        <w:lastRenderedPageBreak/>
         <w:t>Langkah 6: Perancangan System Message / Prompting pada AI Agent</w:t>
+      </w:r>
+    </w:p>
+    <w:p>
+      <w:pPr>
+        <w:pStyle w:val="NormalWeb"/>
+        <w:ind w:left="720"/>
+      </w:pPr>
+      <w:r>
+        <w:t xml:space="preserve">  </w:t>
+      </w:r>
+      <w:r>
+        <w:rPr>
+          <w:b/>
+          <w:bCs/>
+        </w:rPr>
+        <w:t>Penyusunan Instruksi (</w:t>
+      </w:r>
+      <w:r>
+        <w:rPr>
+          <w:b/>
+          <w:bCs/>
+          <w:i/>
+          <w:iCs/>
+        </w:rPr>
+        <w:t>Prompt Engineering</w:t>
+      </w:r>
+      <w:r>
+        <w:rPr>
+          <w:b/>
+          <w:bCs/>
+        </w:rPr>
+        <w:t>):</w:t>
+      </w:r>
+    </w:p>
+    <w:p>
+      <w:pPr>
+        <w:pStyle w:val="NormalWeb"/>
+        <w:ind w:left="720"/>
+      </w:pPr>
+      <w:r>
+        <w:t xml:space="preserve">Node utama AI Agent diatur menggunakan tipe </w:t>
+      </w:r>
+      <w:r>
+        <w:rPr>
+          <w:i/>
+          <w:iCs/>
+        </w:rPr>
+        <w:t>Tools Agent</w:t>
+      </w:r>
+      <w:r>
+        <w:t xml:space="preserve">. Pada bagian </w:t>
+      </w:r>
+      <w:r>
+        <w:rPr>
+          <w:b/>
+          <w:bCs/>
+        </w:rPr>
+        <w:t>System Message</w:t>
+      </w:r>
+      <w:r>
+        <w:t xml:space="preserve">, dirancang instruksi ketat untuk mengarahkan perilaku AI agar profesional, akurat, dan sopan. </w:t>
+      </w:r>
+    </w:p>
+    <w:p>
+      <w:pPr>
+        <w:pStyle w:val="NormalWeb"/>
+        <w:ind w:left="720"/>
+      </w:pPr>
+      <w:r>
+        <w:t xml:space="preserve">  </w:t>
+      </w:r>
+      <w:r>
+        <w:rPr>
+          <w:b/>
+          <w:bCs/>
+        </w:rPr>
+        <w:t>Aturan Utama pada System Message:</w:t>
       </w:r>
     </w:p>
     <w:p>
@@ -1449,29 +2213,99 @@
           <w:ilvl w:val="0"/>
           <w:numId w:val="17"/>
         </w:numPr>
-      </w:pPr>
-      <w:r>
-        <w:t xml:space="preserve">System Message dirancang dengan instruksi ketat agar AI Agent </w:t>
-      </w:r>
+        <w:tabs>
+          <w:tab w:val="clear" w:pos="720"/>
+          <w:tab w:val="num" w:pos="1440"/>
+        </w:tabs>
+        <w:ind w:left="1440"/>
+      </w:pPr>
       <w:r>
         <w:rPr>
           <w:b/>
           <w:bCs/>
         </w:rPr>
-        <w:t>selalu memanggil Tool Google Sheets</w:t>
-      </w:r>
-      <w:r>
-        <w:t xml:space="preserve"> setiap kali ada pertanyaan mengenai daftar produk atau harga, serta melarang AI memberikan jawaban fiktif (</w:t>
+        <w:t>Peran:</w:t>
+      </w:r>
+      <w:r>
+        <w:t xml:space="preserve"> Menjadi Asisten Layanan Pelanggan (</w:t>
       </w:r>
       <w:r>
         <w:rPr>
           <w:i/>
           <w:iCs/>
         </w:rPr>
-        <w:t>hallucination</w:t>
-      </w:r>
-      <w:r>
-        <w:t>).</w:t>
+        <w:t>Customer Service</w:t>
+      </w:r>
+      <w:r>
+        <w:t xml:space="preserve">) yang ramah dan responsif. </w:t>
+      </w:r>
+    </w:p>
+    <w:p>
+      <w:pPr>
+        <w:pStyle w:val="NormalWeb"/>
+        <w:numPr>
+          <w:ilvl w:val="0"/>
+          <w:numId w:val="17"/>
+        </w:numPr>
+        <w:tabs>
+          <w:tab w:val="clear" w:pos="720"/>
+          <w:tab w:val="num" w:pos="1440"/>
+        </w:tabs>
+        <w:ind w:left="1440"/>
+      </w:pPr>
+      <w:r>
+        <w:rPr>
+          <w:b/>
+          <w:bCs/>
+        </w:rPr>
+        <w:t>Kewajiban Penggunaan Tool:</w:t>
+      </w:r>
+      <w:r>
+        <w:t xml:space="preserve"> AI </w:t>
+      </w:r>
+      <w:r>
+        <w:rPr>
+          <w:b/>
+          <w:bCs/>
+        </w:rPr>
+        <w:t>wajib</w:t>
+      </w:r>
+      <w:r>
+        <w:t xml:space="preserve"> memanggil dan memeriksa </w:t>
+      </w:r>
+      <w:r>
+        <w:rPr>
+          <w:i/>
+          <w:iCs/>
+        </w:rPr>
+        <w:t>Tool Google Sheets</w:t>
+      </w:r>
+      <w:r>
+        <w:t xml:space="preserve"> sebelum menjawab pertanyaan terkait daftar produk, deskripsi materi, maupun harga. </w:t>
+      </w:r>
+    </w:p>
+    <w:p>
+      <w:pPr>
+        <w:pStyle w:val="NormalWeb"/>
+        <w:numPr>
+          <w:ilvl w:val="0"/>
+          <w:numId w:val="17"/>
+        </w:numPr>
+        <w:tabs>
+          <w:tab w:val="clear" w:pos="720"/>
+          <w:tab w:val="num" w:pos="1440"/>
+        </w:tabs>
+        <w:ind w:left="1440"/>
+      </w:pPr>
+      <w:r>
+        <w:rPr>
+          <w:b/>
+          <w:bCs/>
+        </w:rPr>
+        <w:t>Integritas Data (Anti-Halusinasi):</w:t>
+      </w:r>
+      <w:r>
+        <w:t xml:space="preserve"> Dilarang keras memberikan estimasi harga atau deskripsi yang tidak tercantum di dalam spreadsheet. Jika data tidak ditemukan, AI harus menyatakan secara jujur bahwa informasi belum tersedia. </w:t>
       </w:r>
     </w:p>
     <w:p>
@@ -1489,6 +2323,7 @@
           <w:bCs/>
           <w:noProof/>
         </w:rPr>
+        <w:lastRenderedPageBreak/>
         <w:drawing>
           <wp:inline distT="0" distB="0" distL="0" distR="0" wp14:anchorId="030B625F" wp14:editId="0C46B19D">
             <wp:extent cx="3892550" cy="3811464"/>
@@ -1550,13 +2385,9 @@
       <w:pPr>
         <w:pStyle w:val="NormalWeb"/>
         <w:jc w:val="center"/>
-        <w:rPr>
-          <w:rFonts w:ascii="Segoe UI Emoji" w:hAnsi="Segoe UI Emoji" w:cs="Segoe UI Emoji"/>
-        </w:rPr>
-      </w:pPr>
-      <w:r>
-        <w:rPr>
-          <w:rFonts w:ascii="Segoe UI Emoji" w:hAnsi="Segoe UI Emoji" w:cs="Segoe UI Emoji"/>
+      </w:pPr>
+      <w:r>
+        <w:rPr>
           <w:noProof/>
         </w:rPr>
         <w:drawing>
@@ -1631,8 +2462,68 @@
           <w:rFonts w:ascii="Times New Roman" w:hAnsi="Times New Roman" w:cs="Times New Roman"/>
           <w:color w:val="auto"/>
         </w:rPr>
-        <w:lastRenderedPageBreak/>
         <w:t>Langkah 7: Pengujian Eksekusi dan Respons pada Canvas n8n</w:t>
+      </w:r>
+    </w:p>
+    <w:p>
+      <w:pPr>
+        <w:pStyle w:val="NormalWeb"/>
+        <w:ind w:left="720"/>
+      </w:pPr>
+      <w:r>
+        <w:t xml:space="preserve">  </w:t>
+      </w:r>
+      <w:r>
+        <w:rPr>
+          <w:b/>
+          <w:bCs/>
+        </w:rPr>
+        <w:t>Simulasi Internal:</w:t>
+      </w:r>
+    </w:p>
+    <w:p>
+      <w:pPr>
+        <w:pStyle w:val="NormalWeb"/>
+        <w:ind w:left="720"/>
+      </w:pPr>
+      <w:r>
+        <w:t>Pengujian awal dilakukan langsung pada lingkungan kerja (</w:t>
+      </w:r>
+      <w:r>
+        <w:rPr>
+          <w:i/>
+          <w:iCs/>
+        </w:rPr>
+        <w:t>canvas</w:t>
+      </w:r>
+      <w:r>
+        <w:t xml:space="preserve">) n8n memanfaatkan fitur panel </w:t>
+      </w:r>
+      <w:r>
+        <w:rPr>
+          <w:i/>
+          <w:iCs/>
+        </w:rPr>
+        <w:t>Chat Widget</w:t>
+      </w:r>
+      <w:r>
+        <w:t xml:space="preserve">. </w:t>
+      </w:r>
+    </w:p>
+    <w:p>
+      <w:pPr>
+        <w:pStyle w:val="NormalWeb"/>
+        <w:ind w:left="720"/>
+      </w:pPr>
+      <w:r>
+        <w:t xml:space="preserve">  </w:t>
+      </w:r>
+      <w:r>
+        <w:rPr>
+          <w:b/>
+          <w:bCs/>
+        </w:rPr>
+        <w:t>Skenario Pengujian:</w:t>
       </w:r>
     </w:p>
     <w:p>
@@ -1642,19 +2533,29 @@
           <w:ilvl w:val="0"/>
           <w:numId w:val="18"/>
         </w:numPr>
-      </w:pPr>
-      <w:r>
-        <w:t xml:space="preserve">Pengujian dilakukan langsung di dalam canvas n8n menggunakan panel </w:t>
-      </w:r>
+        <w:tabs>
+          <w:tab w:val="clear" w:pos="720"/>
+          <w:tab w:val="num" w:pos="1440"/>
+        </w:tabs>
+        <w:ind w:left="1440"/>
+      </w:pPr>
       <w:r>
         <w:rPr>
           <w:b/>
           <w:bCs/>
         </w:rPr>
-        <w:t>Chat Widget</w:t>
-      </w:r>
-      <w:r>
-        <w:t>.</w:t>
+        <w:lastRenderedPageBreak/>
+        <w:t>Input Pengguna:</w:t>
+      </w:r>
+      <w:r>
+        <w:t xml:space="preserve"> </w:t>
+      </w:r>
+      <w:r>
+        <w:rPr>
+          <w:i/>
+          <w:iCs/>
+        </w:rPr>
+        <w:t>"Apa saja program bootcamp yang tersedia dan berapa harganya?"</w:t>
       </w:r>
     </w:p>
     <w:p>
@@ -1664,23 +2565,41 @@
           <w:ilvl w:val="0"/>
           <w:numId w:val="18"/>
         </w:numPr>
+        <w:tabs>
+          <w:tab w:val="clear" w:pos="720"/>
+          <w:tab w:val="num" w:pos="1440"/>
+        </w:tabs>
+        <w:ind w:left="1440"/>
       </w:pPr>
       <w:r>
         <w:rPr>
           <w:b/>
           <w:bCs/>
         </w:rPr>
-        <w:t>Pertanyaan Tes</w:t>
-      </w:r>
-      <w:r>
-        <w:t xml:space="preserve">: </w:t>
+        <w:t>Evaluasi Proses Kerja:</w:t>
+      </w:r>
+      <w:r>
+        <w:t xml:space="preserve"> AI Agent menerima input, memicu (</w:t>
       </w:r>
       <w:r>
         <w:rPr>
           <w:i/>
           <w:iCs/>
         </w:rPr>
-        <w:t>"Apa saja program bootcamp yang tersedia dan berapa harganya?"</w:t>
+        <w:t>trigger</w:t>
+      </w:r>
+      <w:r>
+        <w:t xml:space="preserve">) pemanggilan </w:t>
+      </w:r>
+      <w:r>
+        <w:rPr>
+          <w:i/>
+          <w:iCs/>
+        </w:rPr>
+        <w:t>Tool Google Sheets</w:t>
+      </w:r>
+      <w:r>
+        <w:t xml:space="preserve">, membaca baris data yang relevan, menyusun jawaban secara sistematis, dan mencatat percakapan ke dalam memori. </w:t>
       </w:r>
     </w:p>
     <w:p>
@@ -1690,29 +2609,86 @@
           <w:ilvl w:val="0"/>
           <w:numId w:val="18"/>
         </w:numPr>
+        <w:tabs>
+          <w:tab w:val="clear" w:pos="720"/>
+          <w:tab w:val="num" w:pos="1440"/>
+        </w:tabs>
+        <w:ind w:left="1440"/>
       </w:pPr>
       <w:r>
         <w:rPr>
           <w:b/>
           <w:bCs/>
         </w:rPr>
-        <w:t>Hasil</w:t>
-      </w:r>
-      <w:r>
-        <w:t>: AI Agent sukses mengaktifkan Tool Google Sheets, mengambil data pelatihan (seperti Digital Marketing, Network Engineering, Web Development, Cyber Security, dll. seharga Rp15.000.000), dan menampilkan jawaban yang rapi.</w:t>
-      </w:r>
+        <w:t>Hasil Evaluasi:</w:t>
+      </w:r>
+      <w:r>
+        <w:t xml:space="preserve"> Chatbot sukses menampilkan daftar lengkap program </w:t>
+      </w:r>
+      <w:r>
+        <w:rPr>
+          <w:i/>
+          <w:iCs/>
+        </w:rPr>
+        <w:t>Bootcamp</w:t>
+      </w:r>
+      <w:r>
+        <w:t xml:space="preserve"> (seperti </w:t>
+      </w:r>
+      <w:r>
+        <w:rPr>
+          <w:i/>
+          <w:iCs/>
+        </w:rPr>
+        <w:t>Digital Marketing</w:t>
+      </w:r>
+      <w:r>
+        <w:t xml:space="preserve">, </w:t>
+      </w:r>
+      <w:r>
+        <w:rPr>
+          <w:i/>
+          <w:iCs/>
+        </w:rPr>
+        <w:t>Network Engineering</w:t>
+      </w:r>
+      <w:r>
+        <w:t xml:space="preserve">, </w:t>
+      </w:r>
+      <w:r>
+        <w:rPr>
+          <w:i/>
+          <w:iCs/>
+        </w:rPr>
+        <w:t>Web Development/Fullstack</w:t>
+      </w:r>
+      <w:r>
+        <w:t xml:space="preserve">, </w:t>
+      </w:r>
+      <w:r>
+        <w:rPr>
+          <w:i/>
+          <w:iCs/>
+        </w:rPr>
+        <w:t>Cyber Security</w:t>
+      </w:r>
+      <w:r>
+        <w:t xml:space="preserve">, dll.) beserta harga investasi yang akurat (Rp15.000.000) dalam format teks yang rapi dan mudah dibaca. </w:t>
+      </w:r>
+    </w:p>
+    <w:p>
+      <w:pPr>
+        <w:pStyle w:val="NormalWeb"/>
+        <w:ind w:left="720"/>
+      </w:pPr>
     </w:p>
     <w:p>
       <w:pPr>
         <w:pStyle w:val="NormalWeb"/>
         <w:jc w:val="center"/>
-        <w:rPr>
-          <w:rFonts w:ascii="Segoe UI Emoji" w:hAnsi="Segoe UI Emoji" w:cs="Segoe UI Emoji"/>
-        </w:rPr>
-      </w:pPr>
-      <w:r>
-        <w:rPr>
-          <w:rFonts w:ascii="Segoe UI Emoji" w:hAnsi="Segoe UI Emoji" w:cs="Segoe UI Emoji"/>
+      </w:pPr>
+      <w:r>
+        <w:rPr>
           <w:noProof/>
         </w:rPr>
         <w:drawing>
@@ -1776,13 +2752,9 @@
       <w:pPr>
         <w:pStyle w:val="NormalWeb"/>
         <w:jc w:val="center"/>
-        <w:rPr>
-          <w:rFonts w:ascii="Segoe UI Emoji" w:hAnsi="Segoe UI Emoji" w:cs="Segoe UI Emoji"/>
-        </w:rPr>
-      </w:pPr>
-      <w:r>
-        <w:rPr>
-          <w:rFonts w:ascii="Segoe UI Emoji" w:hAnsi="Segoe UI Emoji" w:cs="Segoe UI Emoji"/>
+      </w:pPr>
+      <w:r>
+        <w:rPr>
           <w:noProof/>
         </w:rPr>
         <w:drawing>
@@ -1861,23 +2833,127 @@
     <w:p>
       <w:pPr>
         <w:pStyle w:val="NormalWeb"/>
-        <w:numPr>
-          <w:ilvl w:val="0"/>
-          <w:numId w:val="19"/>
-        </w:numPr>
-      </w:pPr>
-      <w:r>
-        <w:t xml:space="preserve">Workflow berhasil diterbitkan dengan mengubah status menjadi </w:t>
+        <w:ind w:left="720"/>
+      </w:pPr>
+      <w:r>
+        <w:t xml:space="preserve">  </w:t>
       </w:r>
       <w:r>
         <w:rPr>
           <w:b/>
           <w:bCs/>
         </w:rPr>
+        <w:t>Publikasi Layanan (</w:t>
+      </w:r>
+      <w:r>
+        <w:rPr>
+          <w:b/>
+          <w:bCs/>
+          <w:i/>
+          <w:iCs/>
+        </w:rPr>
+        <w:t>Deployment</w:t>
+      </w:r>
+      <w:r>
+        <w:rPr>
+          <w:b/>
+          <w:bCs/>
+        </w:rPr>
+        <w:t>):</w:t>
+      </w:r>
+    </w:p>
+    <w:p>
+      <w:pPr>
+        <w:pStyle w:val="NormalWeb"/>
+        <w:ind w:left="720"/>
+      </w:pPr>
+      <w:r>
+        <w:t>Setelah pengujian internal dinyatakan berhasil tanpa kendala (</w:t>
+      </w:r>
+      <w:r>
+        <w:rPr>
+          <w:i/>
+          <w:iCs/>
+        </w:rPr>
+        <w:t>error-free</w:t>
+      </w:r>
+      <w:r>
+        <w:t xml:space="preserve">), tombol status </w:t>
+      </w:r>
+      <w:r>
+        <w:rPr>
+          <w:i/>
+          <w:iCs/>
+        </w:rPr>
+        <w:t>Workflow</w:t>
+      </w:r>
+      <w:r>
+        <w:t xml:space="preserve"> diubah dari </w:t>
+      </w:r>
+      <w:r>
+        <w:rPr>
+          <w:i/>
+          <w:iCs/>
+        </w:rPr>
+        <w:t>Draft</w:t>
+      </w:r>
+      <w:r>
+        <w:t xml:space="preserve"> menjadi </w:t>
+      </w:r>
+      <w:r>
+        <w:rPr>
+          <w:b/>
+          <w:bCs/>
+        </w:rPr>
         <w:t>Published (Active)</w:t>
       </w:r>
       <w:r>
-        <w:t>.</w:t>
+        <w:t xml:space="preserve">. </w:t>
+      </w:r>
+    </w:p>
+    <w:p>
+      <w:pPr>
+        <w:pStyle w:val="NormalWeb"/>
+        <w:ind w:left="720"/>
+      </w:pPr>
+      <w:r>
+        <w:t xml:space="preserve">  </w:t>
+      </w:r>
+      <w:r>
+        <w:rPr>
+          <w:b/>
+          <w:bCs/>
+        </w:rPr>
+        <w:t>Pengujian Antarmuka Webchat Publik:</w:t>
+      </w:r>
+    </w:p>
+    <w:p>
+      <w:pPr>
+        <w:pStyle w:val="NormalWeb"/>
+        <w:ind w:left="720"/>
+      </w:pPr>
+      <w:r>
+        <w:t xml:space="preserve">URL antarmuka webchat publik diakses melalui </w:t>
+      </w:r>
+      <w:r>
+        <w:rPr>
+          <w:i/>
+          <w:iCs/>
+        </w:rPr>
+        <w:t>tab</w:t>
+      </w:r>
+      <w:r>
+        <w:t xml:space="preserve"> peramban (</w:t>
+      </w:r>
+      <w:r>
+        <w:rPr>
+          <w:i/>
+          <w:iCs/>
+        </w:rPr>
+        <w:t>browser</w:t>
+      </w:r>
+      <w:r>
+        <w:t xml:space="preserve">) eksternal. </w:t>
       </w:r>
     </w:p>
     <w:p>
@@ -1885,11 +2961,68 @@
         <w:pStyle w:val="NormalWeb"/>
         <w:numPr>
           <w:ilvl w:val="0"/>
-          <w:numId w:val="19"/>
+          <w:numId w:val="26"/>
         </w:numPr>
-      </w:pPr>
-      <w:r>
-        <w:t>Tautan URL Web Chat dipasang dan diuji cobakan melalui tab browser eksternal.</w:t>
+        <w:tabs>
+          <w:tab w:val="clear" w:pos="720"/>
+          <w:tab w:val="num" w:pos="1440"/>
+        </w:tabs>
+        <w:ind w:left="1440"/>
+      </w:pPr>
+      <w:r>
+        <w:rPr>
+          <w:b/>
+          <w:bCs/>
+        </w:rPr>
+        <w:lastRenderedPageBreak/>
+        <w:t>Tampilan Interface:</w:t>
+      </w:r>
+      <w:r>
+        <w:t xml:space="preserve"> Antarmuka webchat publik dapat memuat judul, instruksi awal, dan kotak masukan obrolan dengan sempurna. </w:t>
+      </w:r>
+    </w:p>
+    <w:p>
+      <w:pPr>
+        <w:pStyle w:val="NormalWeb"/>
+        <w:numPr>
+          <w:ilvl w:val="0"/>
+          <w:numId w:val="26"/>
+        </w:numPr>
+        <w:tabs>
+          <w:tab w:val="clear" w:pos="720"/>
+          <w:tab w:val="num" w:pos="1440"/>
+        </w:tabs>
+        <w:ind w:left="1440"/>
+      </w:pPr>
+      <w:r>
+        <w:rPr>
+          <w:b/>
+          <w:bCs/>
+        </w:rPr>
+        <w:t>Pengujian Multi-turn Chat:</w:t>
+      </w:r>
+      <w:r>
+        <w:t xml:space="preserve"> Dilakukan pengujian lanjutan dengan pertanyaan turunan (seperti </w:t>
+      </w:r>
+      <w:r>
+        <w:rPr>
+          <w:i/>
+          <w:iCs/>
+        </w:rPr>
+        <w:t>"cyber"</w:t>
+      </w:r>
+      <w:r>
+        <w:t xml:space="preserve">). Chatbot terbukti mampu merespons secara spesifik berdasarkan konteks percakapan sebelumnya dan data yang ditarik secara </w:t>
+      </w:r>
+      <w:r>
+        <w:rPr>
+          <w:i/>
+          <w:iCs/>
+        </w:rPr>
+        <w:t>real-time</w:t>
+      </w:r>
+      <w:r>
+        <w:t xml:space="preserve"> dari Google Sheets. </w:t>
       </w:r>
     </w:p>
     <w:p>
@@ -1897,100 +3030,20 @@
         <w:pStyle w:val="NormalWeb"/>
         <w:jc w:val="center"/>
         <w:rPr>
-          <w:rFonts w:ascii="Segoe UI Emoji" w:hAnsi="Segoe UI Emoji" w:cs="Segoe UI Emoji"/>
-        </w:rPr>
-      </w:pPr>
-    </w:p>
-    <w:p>
-      <w:pPr>
-        <w:pStyle w:val="NormalWeb"/>
-        <w:jc w:val="center"/>
-        <w:rPr>
           <w:b/>
           <w:bCs/>
         </w:rPr>
       </w:pPr>
       <w:r>
         <w:rPr>
-          <w:rFonts w:ascii="Segoe UI Emoji" w:hAnsi="Segoe UI Emoji" w:cs="Segoe UI Emoji"/>
-          <w:noProof/>
-        </w:rPr>
-        <w:lastRenderedPageBreak/>
+          <w:b/>
+          <w:bCs/>
+        </w:rPr>
         <w:drawing>
-          <wp:inline distT="0" distB="0" distL="0" distR="0" wp14:anchorId="3E24538E" wp14:editId="02646545">
-            <wp:extent cx="3745230" cy="3648075"/>
-            <wp:effectExtent l="0" t="0" r="7620" b="9525"/>
-            <wp:docPr id="12" name="Picture 12"/>
-            <wp:cNvGraphicFramePr>
-              <a:graphicFrameLocks xmlns:a="http://schemas.openxmlformats.org/drawingml/2006/main" noChangeAspect="1"/>
-            </wp:cNvGraphicFramePr>
-            <a:graphic xmlns:a="http://schemas.openxmlformats.org/drawingml/2006/main">
-              <a:graphicData uri="http://schemas.openxmlformats.org/drawingml/2006/picture">
-                <pic:pic xmlns:pic="http://schemas.openxmlformats.org/drawingml/2006/picture">
-                  <pic:nvPicPr>
-                    <pic:cNvPr id="1" name=""/>
-                    <pic:cNvPicPr/>
-                  </pic:nvPicPr>
-                  <pic:blipFill rotWithShape="1">
-                    <a:blip r:embed="rId14"/>
-                    <a:srcRect b="523"/>
-                    <a:stretch/>
-                  </pic:blipFill>
-                  <pic:spPr bwMode="auto">
-                    <a:xfrm>
-                      <a:off x="0" y="0"/>
-                      <a:ext cx="3781853" cy="3683748"/>
-                    </a:xfrm>
-                    <a:prstGeom prst="rect">
-                      <a:avLst/>
-                    </a:prstGeom>
-                    <a:ln>
-                      <a:noFill/>
-                    </a:ln>
-                    <a:extLst>
-                      <a:ext uri="{53640926-AAD7-44D8-BBD7-CCE9431645EC}">
-                        <a14:shadowObscured xmlns:a14="http://schemas.microsoft.com/office/drawing/2010/main"/>
-                      </a:ext>
-                    </a:extLst>
-                  </pic:spPr>
-                </pic:pic>
-              </a:graphicData>
-            </a:graphic>
-          </wp:inline>
-        </w:drawing>
-      </w:r>
-    </w:p>
-    <w:p>
-      <w:pPr>
-        <w:pStyle w:val="NormalWeb"/>
-        <w:jc w:val="center"/>
-        <w:rPr>
-          <w:i/>
-          <w:iCs/>
-        </w:rPr>
-      </w:pPr>
-      <w:r>
-        <w:rPr>
-          <w:b/>
-          <w:bCs/>
-        </w:rPr>
-        <w:t>GAMBAR 10: Status Workflow dalam Kondisi Published</w:t>
-      </w:r>
-    </w:p>
-    <w:p>
-      <w:pPr>
-        <w:pStyle w:val="NormalWeb"/>
-        <w:jc w:val="center"/>
-      </w:pPr>
-      <w:r>
-        <w:rPr>
-          <w:noProof/>
-        </w:rPr>
-        <w:drawing>
-          <wp:inline distT="0" distB="0" distL="0" distR="0" wp14:anchorId="609F9133" wp14:editId="63107087">
-            <wp:extent cx="3731260" cy="3876377"/>
-            <wp:effectExtent l="0" t="0" r="2540" b="0"/>
-            <wp:docPr id="15" name="Picture 15"/>
+          <wp:inline distT="0" distB="0" distL="0" distR="0" wp14:anchorId="3F38385E" wp14:editId="0E37F18C">
+            <wp:extent cx="3685540" cy="3814177"/>
+            <wp:effectExtent l="0" t="0" r="0" b="0"/>
+            <wp:docPr id="6" name="Picture 6"/>
             <wp:cNvGraphicFramePr>
               <a:graphicFrameLocks xmlns:a="http://schemas.openxmlformats.org/drawingml/2006/main" noChangeAspect="1"/>
             </wp:cNvGraphicFramePr>
@@ -2010,7 +3063,7 @@
                   <pic:spPr>
                     <a:xfrm>
                       <a:off x="0" y="0"/>
-                      <a:ext cx="3757841" cy="3903991"/>
+                      <a:ext cx="3712266" cy="3841836"/>
                     </a:xfrm>
                     <a:prstGeom prst="rect">
                       <a:avLst/>
@@ -2027,34 +3080,31 @@
       <w:pPr>
         <w:pStyle w:val="NormalWeb"/>
         <w:jc w:val="center"/>
+        <w:rPr>
+          <w:i/>
+          <w:iCs/>
+        </w:rPr>
       </w:pPr>
       <w:r>
         <w:rPr>
           <w:b/>
           <w:bCs/>
         </w:rPr>
-        <w:t>GAMBAR 11: Tampilan Antarmuka Webchat Publik</w:t>
+        <w:t>GAMBAR 10: Status Workflow dalam Kondisi Published</w:t>
       </w:r>
     </w:p>
     <w:p>
       <w:pPr>
         <w:pStyle w:val="NormalWeb"/>
         <w:jc w:val="center"/>
-        <w:rPr>
-          <w:rFonts w:ascii="Segoe UI Emoji" w:hAnsi="Segoe UI Emoji" w:cs="Segoe UI Emoji"/>
-        </w:rPr>
-      </w:pPr>
-      <w:r>
-        <w:rPr>
-          <w:rFonts w:ascii="Segoe UI Emoji" w:hAnsi="Segoe UI Emoji" w:cs="Segoe UI Emoji"/>
-          <w:noProof/>
-        </w:rPr>
+      </w:pPr>
+      <w:r>
         <w:lastRenderedPageBreak/>
         <w:drawing>
-          <wp:inline distT="0" distB="0" distL="0" distR="0" wp14:anchorId="54E826E4" wp14:editId="524A3491">
-            <wp:extent cx="3625692" cy="3576680"/>
-            <wp:effectExtent l="0" t="0" r="0" b="5080"/>
-            <wp:docPr id="14" name="Picture 14"/>
+          <wp:inline distT="0" distB="0" distL="0" distR="0" wp14:anchorId="2153634F" wp14:editId="408AB282">
+            <wp:extent cx="3748420" cy="3705225"/>
+            <wp:effectExtent l="0" t="0" r="4445" b="0"/>
+            <wp:docPr id="8" name="Picture 8"/>
             <wp:cNvGraphicFramePr>
               <a:graphicFrameLocks xmlns:a="http://schemas.openxmlformats.org/drawingml/2006/main" noChangeAspect="1"/>
             </wp:cNvGraphicFramePr>
@@ -2074,7 +3124,7 @@
                   <pic:spPr>
                     <a:xfrm>
                       <a:off x="0" y="0"/>
-                      <a:ext cx="3639173" cy="3589979"/>
+                      <a:ext cx="3778512" cy="3734970"/>
                     </a:xfrm>
                     <a:prstGeom prst="rect">
                       <a:avLst/>
@@ -2091,6 +3141,62 @@
       <w:pPr>
         <w:pStyle w:val="NormalWeb"/>
         <w:jc w:val="center"/>
+      </w:pPr>
+      <w:r>
+        <w:rPr>
+          <w:b/>
+          <w:bCs/>
+        </w:rPr>
+        <w:t>GAMBAR 11: Tampilan Antarmuka Webchat Publik</w:t>
+      </w:r>
+    </w:p>
+    <w:p>
+      <w:pPr>
+        <w:pStyle w:val="NormalWeb"/>
+        <w:jc w:val="center"/>
+      </w:pPr>
+      <w:r>
+        <w:drawing>
+          <wp:inline distT="0" distB="0" distL="0" distR="0" wp14:anchorId="49E24EFE" wp14:editId="4310C63F">
+            <wp:extent cx="3643760" cy="3594100"/>
+            <wp:effectExtent l="0" t="0" r="0" b="6350"/>
+            <wp:docPr id="13" name="Picture 13"/>
+            <wp:cNvGraphicFramePr>
+              <a:graphicFrameLocks xmlns:a="http://schemas.openxmlformats.org/drawingml/2006/main" noChangeAspect="1"/>
+            </wp:cNvGraphicFramePr>
+            <a:graphic xmlns:a="http://schemas.openxmlformats.org/drawingml/2006/main">
+              <a:graphicData uri="http://schemas.openxmlformats.org/drawingml/2006/picture">
+                <pic:pic xmlns:pic="http://schemas.openxmlformats.org/drawingml/2006/picture">
+                  <pic:nvPicPr>
+                    <pic:cNvPr id="1" name=""/>
+                    <pic:cNvPicPr/>
+                  </pic:nvPicPr>
+                  <pic:blipFill>
+                    <a:blip r:embed="rId17"/>
+                    <a:stretch>
+                      <a:fillRect/>
+                    </a:stretch>
+                  </pic:blipFill>
+                  <pic:spPr>
+                    <a:xfrm>
+                      <a:off x="0" y="0"/>
+                      <a:ext cx="3676914" cy="3626802"/>
+                    </a:xfrm>
+                    <a:prstGeom prst="rect">
+                      <a:avLst/>
+                    </a:prstGeom>
+                  </pic:spPr>
+                </pic:pic>
+              </a:graphicData>
+            </a:graphic>
+          </wp:inline>
+        </w:drawing>
+      </w:r>
+    </w:p>
+    <w:p>
+      <w:pPr>
+        <w:pStyle w:val="NormalWeb"/>
+        <w:jc w:val="center"/>
         <w:rPr>
           <w:i/>
           <w:iCs/>
@@ -2115,6 +3221,7 @@
         <w:pStyle w:val="Heading1"/>
       </w:pPr>
       <w:r>
+        <w:lastRenderedPageBreak/>
         <w:t>TAUTAN DAN BUKTI PENDUKUNG</w:t>
       </w:r>
     </w:p>
@@ -2148,22 +3255,15 @@
       <w:r>
         <w:t xml:space="preserve">URL: </w:t>
       </w:r>
-      <w:hyperlink r:id="rId17" w:history="1">
+      <w:hyperlink r:id="rId18" w:history="1">
         <w:r>
           <w:rPr>
             <w:rStyle w:val="Hyperlink"/>
-            <w:rFonts w:eastAsiaTheme="majorEastAsia"/>
-            <w:sz w:val="20"/>
-            <w:szCs w:val="20"/>
           </w:rPr>
-          <w:t>https://n8n-6kg7whrm91bu.jkt5.sumopod.my.id/webhook/da44482e-b001-4738-b00f-bdcb21398859/chat</w:t>
+          <w:t>https://n8n-6kg7whrm91bu.jkt5.sumopod.my.id/webhook/chatbot-ai-demo/chat</w:t>
         </w:r>
       </w:hyperlink>
       <w:r>
-        <w:rPr>
-          <w:rStyle w:val="HTMLCode"/>
-          <w:rFonts w:ascii="Times New Roman" w:eastAsiaTheme="majorEastAsia" w:hAnsi="Times New Roman" w:cs="Times New Roman"/>
-        </w:rPr>
         <w:t xml:space="preserve"> </w:t>
       </w:r>
     </w:p>
@@ -2197,18 +3297,18 @@
       <w:r>
         <w:t xml:space="preserve">URL: </w:t>
       </w:r>
-      <w:hyperlink r:id="rId18" w:history="1">
+      <w:hyperlink r:id="rId19" w:history="1">
         <w:r>
           <w:rPr>
             <w:rStyle w:val="Hyperlink"/>
-            <w:rFonts w:eastAsiaTheme="majorEastAsia"/>
-            <w:sz w:val="20"/>
-            <w:szCs w:val="20"/>
           </w:rPr>
-          <w:t>https://github.com/Riansyah96/PembuatanWorkFlow-n8n-NFA/blob/main/JSON%20Workflow%20n8n%20Chatbot%20Gemini%20Google%20Sheets.json</w:t>
+          <w:t>https://github.com/Riansyah96/PembuatanWorkFlow-n8n-NFA/blob/main/workflow_chatbot_ai.json</w:t>
         </w:r>
       </w:hyperlink>
       <w:r>
+        <w:t xml:space="preserve"> </w:t>
+      </w:r>
+      <w:r>
         <w:rPr>
           <w:rStyle w:val="HTMLCode"/>
           <w:rFonts w:ascii="Times New Roman" w:eastAsiaTheme="majorEastAsia" w:hAnsi="Times New Roman" w:cs="Times New Roman"/>
@@ -2227,19 +3327,15 @@
     <w:p>
       <w:pPr>
         <w:pStyle w:val="NormalWeb"/>
-      </w:pPr>
-      <w:r>
-        <w:t>Seluruh tahapan perancangan, integrasi sub-node LangChain (Gemini Model, Memory, dan Google Sheets Tool), pengujian internal pada canvas n8n, hingga publikasi antarmuka webchat telah diselesaikan dan tervalidasi 100% berfungsi sesuai dengan spesifikasi kriteria tugas.</w:t>
-      </w:r>
-    </w:p>
-    <w:p>
-      <w:pPr>
-        <w:pStyle w:val="NormalWeb"/>
-        <w:ind w:left="720"/>
-      </w:pPr>
+        <w:ind w:firstLine="720"/>
+      </w:pPr>
+      <w:r>
+        <w:t>Berdasarkan seluruh tahapan perancangan, integrasi sub-node LangChain (meliputi Google Gemini Chat Model, Window Buffer Memory, dan Google Sheets Tool), hingga pengujian interaktif baik secara internal maupun publik, agen AI berbasis webchat ini telah terinstalasi, tervalidasi, dan berfungsi 100% dengan sukses. Sistem terbukti mumpuni dalam mengambil data dinamis dari Google Sheets serta menyajikannya kembali kepada pengguna secara presisi dan komunikatif sesuai kriteria tugas yang ditetapkan.</w:t>
+      </w:r>
       <w:r>
         <w:t xml:space="preserve"> </w:t>
       </w:r>
+      <w:bookmarkEnd w:id="0"/>
     </w:p>
     <w:sectPr>
       <w:pgSz w:w="11920" w:h="16840"/>
@@ -2253,6 +3349,232 @@
 <file path=word/numbering.xml><?xml version="1.0" encoding="utf-8"?>
 <w:numbering xmlns:wpc="http://schemas.microsoft.com/office/word/2010/wordprocessingCanvas" xmlns:cx="http://schemas.microsoft.com/office/drawing/2014/chartex" xmlns:cx1="http://schemas.microsoft.com/office/drawing/2015/9/8/chartex" xmlns:cx2="http://schemas.microsoft.com/office/drawing/2015/10/21/chartex" xmlns:cx3="http://schemas.microsoft.com/office/drawing/2016/5/9/chartex" xmlns:cx4="http://schemas.microsoft.com/office/drawing/2016/5/10/chartex" xmlns:cx5="http://schemas.microsoft.com/office/drawing/2016/5/11/chartex" xmlns:cx6="http://schemas.microsoft.com/office/drawing/2016/5/12/chartex" xmlns:cx7="http://schemas.microsoft.com/office/drawing/2016/5/13/chartex" xmlns:cx8="http://schemas.microsoft.com/office/drawing/2016/5/14/chartex" xmlns:mc="http://schemas.openxmlformats.org/markup-compatibility/2006" xmlns:aink="http://schemas.microsoft.com/office/drawing/2016/ink" xmlns:am3d="http://schemas.microsoft.com/office/drawing/2017/model3d" xmlns:o="urn:schemas-microsoft-com:office:office" xmlns:r="http://schemas.openxmlformats.org/officeDocument/2006/relationships" xmlns:m="http://schemas.openxmlformats.org/officeDocument/2006/math" xmlns:v="urn:schemas-microsoft-com:vml" xmlns:wp14="http://schemas.microsoft.com/office/word/2010/wordprocessingDrawing" xmlns:wp="http://schemas.openxmlformats.org/drawingml/2006/wordprocessingDrawing" xmlns:w10="urn:schemas-microsoft-com:office:word" xmlns:w="http://schemas.openxmlformats.org/wordprocessingml/2006/main" xmlns:w14="http://schemas.microsoft.com/office/word/2010/wordml" xmlns:w15="http://schemas.microsoft.com/office/word/2012/wordml" xmlns:w16cex="http://schemas.microsoft.com/office/word/2018/wordml/cex" xmlns:w16cid="http://schemas.microsoft.com/office/word/2016/wordml/cid" xmlns:w16="http://schemas.microsoft.com/office/word/2018/wordml" xmlns:w16se="http://schemas.microsoft.com/office/word/2015/wordml/symex" xmlns:wpg="http://schemas.microsoft.com/office/word/2010/wordprocessingGroup" xmlns:wpi="http://schemas.microsoft.com/office/word/2010/wordprocessingInk" xmlns:wne="http://schemas.microsoft.com/office/word/2006/wordml" xmlns:wps="http://schemas.microsoft.com/office/word/2010/wordprocessingShape" mc:Ignorable="w14 w15 w16se w16cid w16 w16cex wp14">
   <w:abstractNum w:abstractNumId="0" w15:restartNumberingAfterBreak="0">
+    <w:nsid w:val="09121B14"/>
+    <w:multiLevelType w:val="multilevel"/>
+    <w:tmpl w:val="E9B6818E"/>
+    <w:lvl w:ilvl="0">
+      <w:start w:val="1"/>
+      <w:numFmt w:val="decimal"/>
+      <w:lvlText w:val="%1."/>
+      <w:lvlJc w:val="left"/>
+      <w:pPr>
+        <w:tabs>
+          <w:tab w:val="num" w:pos="720"/>
+        </w:tabs>
+        <w:ind w:left="720" w:hanging="360"/>
+      </w:pPr>
+    </w:lvl>
+    <w:lvl w:ilvl="1" w:tentative="1">
+      <w:start w:val="1"/>
+      <w:numFmt w:val="decimal"/>
+      <w:lvlText w:val="%2."/>
+      <w:lvlJc w:val="left"/>
+      <w:pPr>
+        <w:tabs>
+          <w:tab w:val="num" w:pos="1440"/>
+        </w:tabs>
+        <w:ind w:left="1440" w:hanging="360"/>
+      </w:pPr>
+    </w:lvl>
+    <w:lvl w:ilvl="2" w:tentative="1">
+      <w:start w:val="1"/>
+      <w:numFmt w:val="decimal"/>
+      <w:lvlText w:val="%3."/>
+      <w:lvlJc w:val="left"/>
+      <w:pPr>
+        <w:tabs>
+          <w:tab w:val="num" w:pos="2160"/>
+        </w:tabs>
+        <w:ind w:left="2160" w:hanging="360"/>
+      </w:pPr>
+    </w:lvl>
+    <w:lvl w:ilvl="3" w:tentative="1">
+      <w:start w:val="1"/>
+      <w:numFmt w:val="decimal"/>
+      <w:lvlText w:val="%4."/>
+      <w:lvlJc w:val="left"/>
+      <w:pPr>
+        <w:tabs>
+          <w:tab w:val="num" w:pos="2880"/>
+        </w:tabs>
+        <w:ind w:left="2880" w:hanging="360"/>
+      </w:pPr>
+    </w:lvl>
+    <w:lvl w:ilvl="4" w:tentative="1">
+      <w:start w:val="1"/>
+      <w:numFmt w:val="decimal"/>
+      <w:lvlText w:val="%5."/>
+      <w:lvlJc w:val="left"/>
+      <w:pPr>
+        <w:tabs>
+          <w:tab w:val="num" w:pos="3600"/>
+        </w:tabs>
+        <w:ind w:left="3600" w:hanging="360"/>
+      </w:pPr>
+    </w:lvl>
+    <w:lvl w:ilvl="5" w:tentative="1">
+      <w:start w:val="1"/>
+      <w:numFmt w:val="decimal"/>
+      <w:lvlText w:val="%6."/>
+      <w:lvlJc w:val="left"/>
+      <w:pPr>
+        <w:tabs>
+          <w:tab w:val="num" w:pos="4320"/>
+        </w:tabs>
+        <w:ind w:left="4320" w:hanging="360"/>
+      </w:pPr>
+    </w:lvl>
+    <w:lvl w:ilvl="6" w:tentative="1">
+      <w:start w:val="1"/>
+      <w:numFmt w:val="decimal"/>
+      <w:lvlText w:val="%7."/>
+      <w:lvlJc w:val="left"/>
+      <w:pPr>
+        <w:tabs>
+          <w:tab w:val="num" w:pos="5040"/>
+        </w:tabs>
+        <w:ind w:left="5040" w:hanging="360"/>
+      </w:pPr>
+    </w:lvl>
+    <w:lvl w:ilvl="7" w:tentative="1">
+      <w:start w:val="1"/>
+      <w:numFmt w:val="decimal"/>
+      <w:lvlText w:val="%8."/>
+      <w:lvlJc w:val="left"/>
+      <w:pPr>
+        <w:tabs>
+          <w:tab w:val="num" w:pos="5760"/>
+        </w:tabs>
+        <w:ind w:left="5760" w:hanging="360"/>
+      </w:pPr>
+    </w:lvl>
+    <w:lvl w:ilvl="8" w:tentative="1">
+      <w:start w:val="1"/>
+      <w:numFmt w:val="decimal"/>
+      <w:lvlText w:val="%9."/>
+      <w:lvlJc w:val="left"/>
+      <w:pPr>
+        <w:tabs>
+          <w:tab w:val="num" w:pos="6480"/>
+        </w:tabs>
+        <w:ind w:left="6480" w:hanging="360"/>
+      </w:pPr>
+    </w:lvl>
+  </w:abstractNum>
+  <w:abstractNum w:abstractNumId="1" w15:restartNumberingAfterBreak="0">
+    <w:nsid w:val="09900E60"/>
+    <w:multiLevelType w:val="multilevel"/>
+    <w:tmpl w:val="61846450"/>
+    <w:lvl w:ilvl="0">
+      <w:start w:val="1"/>
+      <w:numFmt w:val="decimal"/>
+      <w:lvlText w:val="%1."/>
+      <w:lvlJc w:val="left"/>
+      <w:pPr>
+        <w:tabs>
+          <w:tab w:val="num" w:pos="720"/>
+        </w:tabs>
+        <w:ind w:left="720" w:hanging="360"/>
+      </w:pPr>
+    </w:lvl>
+    <w:lvl w:ilvl="1" w:tentative="1">
+      <w:start w:val="1"/>
+      <w:numFmt w:val="decimal"/>
+      <w:lvlText w:val="%2."/>
+      <w:lvlJc w:val="left"/>
+      <w:pPr>
+        <w:tabs>
+          <w:tab w:val="num" w:pos="1440"/>
+        </w:tabs>
+        <w:ind w:left="1440" w:hanging="360"/>
+      </w:pPr>
+    </w:lvl>
+    <w:lvl w:ilvl="2" w:tentative="1">
+      <w:start w:val="1"/>
+      <w:numFmt w:val="decimal"/>
+      <w:lvlText w:val="%3."/>
+      <w:lvlJc w:val="left"/>
+      <w:pPr>
+        <w:tabs>
+          <w:tab w:val="num" w:pos="2160"/>
+        </w:tabs>
+        <w:ind w:left="2160" w:hanging="360"/>
+      </w:pPr>
+    </w:lvl>
+    <w:lvl w:ilvl="3" w:tentative="1">
+      <w:start w:val="1"/>
+      <w:numFmt w:val="decimal"/>
+      <w:lvlText w:val="%4."/>
+      <w:lvlJc w:val="left"/>
+      <w:pPr>
+        <w:tabs>
+          <w:tab w:val="num" w:pos="2880"/>
+        </w:tabs>
+        <w:ind w:left="2880" w:hanging="360"/>
+      </w:pPr>
+    </w:lvl>
+    <w:lvl w:ilvl="4" w:tentative="1">
+      <w:start w:val="1"/>
+      <w:numFmt w:val="decimal"/>
+      <w:lvlText w:val="%5."/>
+      <w:lvlJc w:val="left"/>
+      <w:pPr>
+        <w:tabs>
+          <w:tab w:val="num" w:pos="3600"/>
+        </w:tabs>
+        <w:ind w:left="3600" w:hanging="360"/>
+      </w:pPr>
+    </w:lvl>
+    <w:lvl w:ilvl="5" w:tentative="1">
+      <w:start w:val="1"/>
+      <w:numFmt w:val="decimal"/>
+      <w:lvlText w:val="%6."/>
+      <w:lvlJc w:val="left"/>
+      <w:pPr>
+        <w:tabs>
+          <w:tab w:val="num" w:pos="4320"/>
+        </w:tabs>
+        <w:ind w:left="4320" w:hanging="360"/>
+      </w:pPr>
+    </w:lvl>
+    <w:lvl w:ilvl="6" w:tentative="1">
+      <w:start w:val="1"/>
+      <w:numFmt w:val="decimal"/>
+      <w:lvlText w:val="%7."/>
+      <w:lvlJc w:val="left"/>
+      <w:pPr>
+        <w:tabs>
+          <w:tab w:val="num" w:pos="5040"/>
+        </w:tabs>
+        <w:ind w:left="5040" w:hanging="360"/>
+      </w:pPr>
+    </w:lvl>
+    <w:lvl w:ilvl="7" w:tentative="1">
+      <w:start w:val="1"/>
+      <w:numFmt w:val="decimal"/>
+      <w:lvlText w:val="%8."/>
+      <w:lvlJc w:val="left"/>
+      <w:pPr>
+        <w:tabs>
+          <w:tab w:val="num" w:pos="5760"/>
+        </w:tabs>
+        <w:ind w:left="5760" w:hanging="360"/>
+      </w:pPr>
+    </w:lvl>
+    <w:lvl w:ilvl="8" w:tentative="1">
+      <w:start w:val="1"/>
+      <w:numFmt w:val="decimal"/>
+      <w:lvlText w:val="%9."/>
+      <w:lvlJc w:val="left"/>
+      <w:pPr>
+        <w:tabs>
+          <w:tab w:val="num" w:pos="6480"/>
+        </w:tabs>
+        <w:ind w:left="6480" w:hanging="360"/>
+      </w:pPr>
+    </w:lvl>
+  </w:abstractNum>
+  <w:abstractNum w:abstractNumId="2" w15:restartNumberingAfterBreak="0">
     <w:nsid w:val="0A5508EB"/>
     <w:multiLevelType w:val="multilevel"/>
     <w:tmpl w:val="C4162446"/>
@@ -2401,7 +3723,7 @@
       </w:rPr>
     </w:lvl>
   </w:abstractNum>
-  <w:abstractNum w:abstractNumId="1" w15:restartNumberingAfterBreak="0">
+  <w:abstractNum w:abstractNumId="3" w15:restartNumberingAfterBreak="0">
     <w:nsid w:val="0AB56B5D"/>
     <w:multiLevelType w:val="multilevel"/>
     <w:tmpl w:val="35E61486"/>
@@ -2550,7 +3872,7 @@
       </w:rPr>
     </w:lvl>
   </w:abstractNum>
-  <w:abstractNum w:abstractNumId="2" w15:restartNumberingAfterBreak="0">
+  <w:abstractNum w:abstractNumId="4" w15:restartNumberingAfterBreak="0">
     <w:nsid w:val="0BD93146"/>
     <w:multiLevelType w:val="multilevel"/>
     <w:tmpl w:val="1996D77A"/>
@@ -2699,7 +4021,156 @@
       </w:rPr>
     </w:lvl>
   </w:abstractNum>
-  <w:abstractNum w:abstractNumId="3" w15:restartNumberingAfterBreak="0">
+  <w:abstractNum w:abstractNumId="5" w15:restartNumberingAfterBreak="0">
+    <w:nsid w:val="0F4A30AA"/>
+    <w:multiLevelType w:val="multilevel"/>
+    <w:tmpl w:val="38DCA3A4"/>
+    <w:lvl w:ilvl="0">
+      <w:start w:val="1"/>
+      <w:numFmt w:val="bullet"/>
+      <w:lvlText w:val=""/>
+      <w:lvlJc w:val="left"/>
+      <w:pPr>
+        <w:tabs>
+          <w:tab w:val="num" w:pos="720"/>
+        </w:tabs>
+        <w:ind w:left="720" w:hanging="360"/>
+      </w:pPr>
+      <w:rPr>
+        <w:rFonts w:ascii="Symbol" w:hAnsi="Symbol" w:hint="default"/>
+        <w:sz w:val="20"/>
+      </w:rPr>
+    </w:lvl>
+    <w:lvl w:ilvl="1" w:tentative="1">
+      <w:start w:val="1"/>
+      <w:numFmt w:val="bullet"/>
+      <w:lvlText w:val="o"/>
+      <w:lvlJc w:val="left"/>
+      <w:pPr>
+        <w:tabs>
+          <w:tab w:val="num" w:pos="1440"/>
+        </w:tabs>
+        <w:ind w:left="1440" w:hanging="360"/>
+      </w:pPr>
+      <w:rPr>
+        <w:rFonts w:ascii="Courier New" w:hAnsi="Courier New" w:hint="default"/>
+        <w:sz w:val="20"/>
+      </w:rPr>
+    </w:lvl>
+    <w:lvl w:ilvl="2" w:tentative="1">
+      <w:start w:val="1"/>
+      <w:numFmt w:val="bullet"/>
+      <w:lvlText w:val=""/>
+      <w:lvlJc w:val="left"/>
+      <w:pPr>
+        <w:tabs>
+          <w:tab w:val="num" w:pos="2160"/>
+        </w:tabs>
+        <w:ind w:left="2160" w:hanging="360"/>
+      </w:pPr>
+      <w:rPr>
+        <w:rFonts w:ascii="Wingdings" w:hAnsi="Wingdings" w:hint="default"/>
+        <w:sz w:val="20"/>
+      </w:rPr>
+    </w:lvl>
+    <w:lvl w:ilvl="3" w:tentative="1">
+      <w:start w:val="1"/>
+      <w:numFmt w:val="bullet"/>
+      <w:lvlText w:val=""/>
+      <w:lvlJc w:val="left"/>
+      <w:pPr>
+        <w:tabs>
+          <w:tab w:val="num" w:pos="2880"/>
+        </w:tabs>
+        <w:ind w:left="2880" w:hanging="360"/>
+      </w:pPr>
+      <w:rPr>
+        <w:rFonts w:ascii="Wingdings" w:hAnsi="Wingdings" w:hint="default"/>
+        <w:sz w:val="20"/>
+      </w:rPr>
+    </w:lvl>
+    <w:lvl w:ilvl="4" w:tentative="1">
+      <w:start w:val="1"/>
+      <w:numFmt w:val="bullet"/>
+      <w:lvlText w:val=""/>
+      <w:lvlJc w:val="left"/>
+      <w:pPr>
+        <w:tabs>
+          <w:tab w:val="num" w:pos="3600"/>
+        </w:tabs>
+        <w:ind w:left="3600" w:hanging="360"/>
+      </w:pPr>
+      <w:rPr>
+        <w:rFonts w:ascii="Wingdings" w:hAnsi="Wingdings" w:hint="default"/>
+        <w:sz w:val="20"/>
+      </w:rPr>
+    </w:lvl>
+    <w:lvl w:ilvl="5" w:tentative="1">
+      <w:start w:val="1"/>
+      <w:numFmt w:val="bullet"/>
+      <w:lvlText w:val=""/>
+      <w:lvlJc w:val="left"/>
+      <w:pPr>
+        <w:tabs>
+          <w:tab w:val="num" w:pos="4320"/>
+        </w:tabs>
+        <w:ind w:left="4320" w:hanging="360"/>
+      </w:pPr>
+      <w:rPr>
+        <w:rFonts w:ascii="Wingdings" w:hAnsi="Wingdings" w:hint="default"/>
+        <w:sz w:val="20"/>
+      </w:rPr>
+    </w:lvl>
+    <w:lvl w:ilvl="6" w:tentative="1">
+      <w:start w:val="1"/>
+      <w:numFmt w:val="bullet"/>
+      <w:lvlText w:val=""/>
+      <w:lvlJc w:val="left"/>
+      <w:pPr>
+        <w:tabs>
+          <w:tab w:val="num" w:pos="5040"/>
+        </w:tabs>
+        <w:ind w:left="5040" w:hanging="360"/>
+      </w:pPr>
+      <w:rPr>
+        <w:rFonts w:ascii="Wingdings" w:hAnsi="Wingdings" w:hint="default"/>
+        <w:sz w:val="20"/>
+      </w:rPr>
+    </w:lvl>
+    <w:lvl w:ilvl="7" w:tentative="1">
+      <w:start w:val="1"/>
+      <w:numFmt w:val="bullet"/>
+      <w:lvlText w:val=""/>
+      <w:lvlJc w:val="left"/>
+      <w:pPr>
+        <w:tabs>
+          <w:tab w:val="num" w:pos="5760"/>
+        </w:tabs>
+        <w:ind w:left="5760" w:hanging="360"/>
+      </w:pPr>
+      <w:rPr>
+        <w:rFonts w:ascii="Wingdings" w:hAnsi="Wingdings" w:hint="default"/>
+        <w:sz w:val="20"/>
+      </w:rPr>
+    </w:lvl>
+    <w:lvl w:ilvl="8" w:tentative="1">
+      <w:start w:val="1"/>
+      <w:numFmt w:val="bullet"/>
+      <w:lvlText w:val=""/>
+      <w:lvlJc w:val="left"/>
+      <w:pPr>
+        <w:tabs>
+          <w:tab w:val="num" w:pos="6480"/>
+        </w:tabs>
+        <w:ind w:left="6480" w:hanging="360"/>
+      </w:pPr>
+      <w:rPr>
+        <w:rFonts w:ascii="Wingdings" w:hAnsi="Wingdings" w:hint="default"/>
+        <w:sz w:val="20"/>
+      </w:rPr>
+    </w:lvl>
+  </w:abstractNum>
+  <w:abstractNum w:abstractNumId="6" w15:restartNumberingAfterBreak="0">
     <w:nsid w:val="25892996"/>
     <w:multiLevelType w:val="multilevel"/>
     <w:tmpl w:val="567C635A"/>
@@ -2848,7 +4319,156 @@
       </w:rPr>
     </w:lvl>
   </w:abstractNum>
-  <w:abstractNum w:abstractNumId="4" w15:restartNumberingAfterBreak="0">
+  <w:abstractNum w:abstractNumId="7" w15:restartNumberingAfterBreak="0">
+    <w:nsid w:val="28156485"/>
+    <w:multiLevelType w:val="multilevel"/>
+    <w:tmpl w:val="0128AD40"/>
+    <w:lvl w:ilvl="0">
+      <w:start w:val="1"/>
+      <w:numFmt w:val="bullet"/>
+      <w:lvlText w:val=""/>
+      <w:lvlJc w:val="left"/>
+      <w:pPr>
+        <w:tabs>
+          <w:tab w:val="num" w:pos="720"/>
+        </w:tabs>
+        <w:ind w:left="720" w:hanging="360"/>
+      </w:pPr>
+      <w:rPr>
+        <w:rFonts w:ascii="Symbol" w:hAnsi="Symbol" w:hint="default"/>
+        <w:sz w:val="20"/>
+      </w:rPr>
+    </w:lvl>
+    <w:lvl w:ilvl="1" w:tentative="1">
+      <w:start w:val="1"/>
+      <w:numFmt w:val="bullet"/>
+      <w:lvlText w:val="o"/>
+      <w:lvlJc w:val="left"/>
+      <w:pPr>
+        <w:tabs>
+          <w:tab w:val="num" w:pos="1440"/>
+        </w:tabs>
+        <w:ind w:left="1440" w:hanging="360"/>
+      </w:pPr>
+      <w:rPr>
+        <w:rFonts w:ascii="Courier New" w:hAnsi="Courier New" w:hint="default"/>
+        <w:sz w:val="20"/>
+      </w:rPr>
+    </w:lvl>
+    <w:lvl w:ilvl="2" w:tentative="1">
+      <w:start w:val="1"/>
+      <w:numFmt w:val="bullet"/>
+      <w:lvlText w:val=""/>
+      <w:lvlJc w:val="left"/>
+      <w:pPr>
+        <w:tabs>
+          <w:tab w:val="num" w:pos="2160"/>
+        </w:tabs>
+        <w:ind w:left="2160" w:hanging="360"/>
+      </w:pPr>
+      <w:rPr>
+        <w:rFonts w:ascii="Wingdings" w:hAnsi="Wingdings" w:hint="default"/>
+        <w:sz w:val="20"/>
+      </w:rPr>
+    </w:lvl>
+    <w:lvl w:ilvl="3" w:tentative="1">
+      <w:start w:val="1"/>
+      <w:numFmt w:val="bullet"/>
+      <w:lvlText w:val=""/>
+      <w:lvlJc w:val="left"/>
+      <w:pPr>
+        <w:tabs>
+          <w:tab w:val="num" w:pos="2880"/>
+        </w:tabs>
+        <w:ind w:left="2880" w:hanging="360"/>
+      </w:pPr>
+      <w:rPr>
+        <w:rFonts w:ascii="Wingdings" w:hAnsi="Wingdings" w:hint="default"/>
+        <w:sz w:val="20"/>
+      </w:rPr>
+    </w:lvl>
+    <w:lvl w:ilvl="4" w:tentative="1">
+      <w:start w:val="1"/>
+      <w:numFmt w:val="bullet"/>
+      <w:lvlText w:val=""/>
+      <w:lvlJc w:val="left"/>
+      <w:pPr>
+        <w:tabs>
+          <w:tab w:val="num" w:pos="3600"/>
+        </w:tabs>
+        <w:ind w:left="3600" w:hanging="360"/>
+      </w:pPr>
+      <w:rPr>
+        <w:rFonts w:ascii="Wingdings" w:hAnsi="Wingdings" w:hint="default"/>
+        <w:sz w:val="20"/>
+      </w:rPr>
+    </w:lvl>
+    <w:lvl w:ilvl="5" w:tentative="1">
+      <w:start w:val="1"/>
+      <w:numFmt w:val="bullet"/>
+      <w:lvlText w:val=""/>
+      <w:lvlJc w:val="left"/>
+      <w:pPr>
+        <w:tabs>
+          <w:tab w:val="num" w:pos="4320"/>
+        </w:tabs>
+        <w:ind w:left="4320" w:hanging="360"/>
+      </w:pPr>
+      <w:rPr>
+        <w:rFonts w:ascii="Wingdings" w:hAnsi="Wingdings" w:hint="default"/>
+        <w:sz w:val="20"/>
+      </w:rPr>
+    </w:lvl>
+    <w:lvl w:ilvl="6" w:tentative="1">
+      <w:start w:val="1"/>
+      <w:numFmt w:val="bullet"/>
+      <w:lvlText w:val=""/>
+      <w:lvlJc w:val="left"/>
+      <w:pPr>
+        <w:tabs>
+          <w:tab w:val="num" w:pos="5040"/>
+        </w:tabs>
+        <w:ind w:left="5040" w:hanging="360"/>
+      </w:pPr>
+      <w:rPr>
+        <w:rFonts w:ascii="Wingdings" w:hAnsi="Wingdings" w:hint="default"/>
+        <w:sz w:val="20"/>
+      </w:rPr>
+    </w:lvl>
+    <w:lvl w:ilvl="7" w:tentative="1">
+      <w:start w:val="1"/>
+      <w:numFmt w:val="bullet"/>
+      <w:lvlText w:val=""/>
+      <w:lvlJc w:val="left"/>
+      <w:pPr>
+        <w:tabs>
+          <w:tab w:val="num" w:pos="5760"/>
+        </w:tabs>
+        <w:ind w:left="5760" w:hanging="360"/>
+      </w:pPr>
+      <w:rPr>
+        <w:rFonts w:ascii="Wingdings" w:hAnsi="Wingdings" w:hint="default"/>
+        <w:sz w:val="20"/>
+      </w:rPr>
+    </w:lvl>
+    <w:lvl w:ilvl="8" w:tentative="1">
+      <w:start w:val="1"/>
+      <w:numFmt w:val="bullet"/>
+      <w:lvlText w:val=""/>
+      <w:lvlJc w:val="left"/>
+      <w:pPr>
+        <w:tabs>
+          <w:tab w:val="num" w:pos="6480"/>
+        </w:tabs>
+        <w:ind w:left="6480" w:hanging="360"/>
+      </w:pPr>
+      <w:rPr>
+        <w:rFonts w:ascii="Wingdings" w:hAnsi="Wingdings" w:hint="default"/>
+        <w:sz w:val="20"/>
+      </w:rPr>
+    </w:lvl>
+  </w:abstractNum>
+  <w:abstractNum w:abstractNumId="8" w15:restartNumberingAfterBreak="0">
     <w:nsid w:val="290A15FF"/>
     <w:multiLevelType w:val="multilevel"/>
     <w:tmpl w:val="18BE7FD4"/>
@@ -2965,7 +4585,7 @@
       </w:pPr>
     </w:lvl>
   </w:abstractNum>
-  <w:abstractNum w:abstractNumId="5" w15:restartNumberingAfterBreak="0">
+  <w:abstractNum w:abstractNumId="9" w15:restartNumberingAfterBreak="0">
     <w:nsid w:val="29671D89"/>
     <w:multiLevelType w:val="multilevel"/>
     <w:tmpl w:val="8828F1AE"/>
@@ -3114,7 +4734,7 @@
       </w:rPr>
     </w:lvl>
   </w:abstractNum>
-  <w:abstractNum w:abstractNumId="6" w15:restartNumberingAfterBreak="0">
+  <w:abstractNum w:abstractNumId="10" w15:restartNumberingAfterBreak="0">
     <w:nsid w:val="2FD95EE6"/>
     <w:multiLevelType w:val="multilevel"/>
     <w:tmpl w:val="CE94865E"/>
@@ -3335,7 +4955,7 @@
       </w:rPr>
     </w:lvl>
   </w:abstractNum>
-  <w:abstractNum w:abstractNumId="7" w15:restartNumberingAfterBreak="0">
+  <w:abstractNum w:abstractNumId="11" w15:restartNumberingAfterBreak="0">
     <w:nsid w:val="305735BE"/>
     <w:multiLevelType w:val="multilevel"/>
     <w:tmpl w:val="CC603E1A"/>
@@ -3484,7 +5104,7 @@
       </w:rPr>
     </w:lvl>
   </w:abstractNum>
-  <w:abstractNum w:abstractNumId="8" w15:restartNumberingAfterBreak="0">
+  <w:abstractNum w:abstractNumId="12" w15:restartNumberingAfterBreak="0">
     <w:nsid w:val="307B0CB4"/>
     <w:multiLevelType w:val="multilevel"/>
     <w:tmpl w:val="FCE21716"/>
@@ -3633,7 +5253,7 @@
       </w:rPr>
     </w:lvl>
   </w:abstractNum>
-  <w:abstractNum w:abstractNumId="9" w15:restartNumberingAfterBreak="0">
+  <w:abstractNum w:abstractNumId="13" w15:restartNumberingAfterBreak="0">
     <w:nsid w:val="326474E3"/>
     <w:multiLevelType w:val="multilevel"/>
     <w:tmpl w:val="FBA6C33A"/>
@@ -3782,7 +5402,7 @@
       </w:rPr>
     </w:lvl>
   </w:abstractNum>
-  <w:abstractNum w:abstractNumId="10" w15:restartNumberingAfterBreak="0">
+  <w:abstractNum w:abstractNumId="14" w15:restartNumberingAfterBreak="0">
     <w:nsid w:val="3B5031DC"/>
     <w:multiLevelType w:val="multilevel"/>
     <w:tmpl w:val="F1025820"/>
@@ -3931,7 +5551,7 @@
       </w:rPr>
     </w:lvl>
   </w:abstractNum>
-  <w:abstractNum w:abstractNumId="11" w15:restartNumberingAfterBreak="0">
+  <w:abstractNum w:abstractNumId="15" w15:restartNumberingAfterBreak="0">
     <w:nsid w:val="40780BCA"/>
     <w:multiLevelType w:val="multilevel"/>
     <w:tmpl w:val="C61CB8BE"/>
@@ -4154,7 +5774,7 @@
       </w:rPr>
     </w:lvl>
   </w:abstractNum>
-  <w:abstractNum w:abstractNumId="12" w15:restartNumberingAfterBreak="0">
+  <w:abstractNum w:abstractNumId="16" w15:restartNumberingAfterBreak="0">
     <w:nsid w:val="475A0CA0"/>
     <w:multiLevelType w:val="multilevel"/>
     <w:tmpl w:val="0FE64298"/>
@@ -4267,7 +5887,7 @@
       </w:pPr>
     </w:lvl>
   </w:abstractNum>
-  <w:abstractNum w:abstractNumId="13" w15:restartNumberingAfterBreak="0">
+  <w:abstractNum w:abstractNumId="17" w15:restartNumberingAfterBreak="0">
     <w:nsid w:val="4CFB05C9"/>
     <w:multiLevelType w:val="multilevel"/>
     <w:tmpl w:val="43EE7766"/>
@@ -4416,7 +6036,7 @@
       </w:rPr>
     </w:lvl>
   </w:abstractNum>
-  <w:abstractNum w:abstractNumId="14" w15:restartNumberingAfterBreak="0">
+  <w:abstractNum w:abstractNumId="18" w15:restartNumberingAfterBreak="0">
     <w:nsid w:val="4FEC54CD"/>
     <w:multiLevelType w:val="multilevel"/>
     <w:tmpl w:val="1CCADCAA"/>
@@ -4565,7 +6185,305 @@
       </w:rPr>
     </w:lvl>
   </w:abstractNum>
-  <w:abstractNum w:abstractNumId="15" w15:restartNumberingAfterBreak="0">
+  <w:abstractNum w:abstractNumId="19" w15:restartNumberingAfterBreak="0">
+    <w:nsid w:val="50C55926"/>
+    <w:multiLevelType w:val="multilevel"/>
+    <w:tmpl w:val="9B0CAF1C"/>
+    <w:lvl w:ilvl="0">
+      <w:start w:val="1"/>
+      <w:numFmt w:val="bullet"/>
+      <w:lvlText w:val=""/>
+      <w:lvlJc w:val="left"/>
+      <w:pPr>
+        <w:tabs>
+          <w:tab w:val="num" w:pos="720"/>
+        </w:tabs>
+        <w:ind w:left="720" w:hanging="360"/>
+      </w:pPr>
+      <w:rPr>
+        <w:rFonts w:ascii="Symbol" w:hAnsi="Symbol" w:hint="default"/>
+        <w:sz w:val="20"/>
+      </w:rPr>
+    </w:lvl>
+    <w:lvl w:ilvl="1" w:tentative="1">
+      <w:start w:val="1"/>
+      <w:numFmt w:val="bullet"/>
+      <w:lvlText w:val="o"/>
+      <w:lvlJc w:val="left"/>
+      <w:pPr>
+        <w:tabs>
+          <w:tab w:val="num" w:pos="1440"/>
+        </w:tabs>
+        <w:ind w:left="1440" w:hanging="360"/>
+      </w:pPr>
+      <w:rPr>
+        <w:rFonts w:ascii="Courier New" w:hAnsi="Courier New" w:hint="default"/>
+        <w:sz w:val="20"/>
+      </w:rPr>
+    </w:lvl>
+    <w:lvl w:ilvl="2" w:tentative="1">
+      <w:start w:val="1"/>
+      <w:numFmt w:val="bullet"/>
+      <w:lvlText w:val=""/>
+      <w:lvlJc w:val="left"/>
+      <w:pPr>
+        <w:tabs>
+          <w:tab w:val="num" w:pos="2160"/>
+        </w:tabs>
+        <w:ind w:left="2160" w:hanging="360"/>
+      </w:pPr>
+      <w:rPr>
+        <w:rFonts w:ascii="Wingdings" w:hAnsi="Wingdings" w:hint="default"/>
+        <w:sz w:val="20"/>
+      </w:rPr>
+    </w:lvl>
+    <w:lvl w:ilvl="3" w:tentative="1">
+      <w:start w:val="1"/>
+      <w:numFmt w:val="bullet"/>
+      <w:lvlText w:val=""/>
+      <w:lvlJc w:val="left"/>
+      <w:pPr>
+        <w:tabs>
+          <w:tab w:val="num" w:pos="2880"/>
+        </w:tabs>
+        <w:ind w:left="2880" w:hanging="360"/>
+      </w:pPr>
+      <w:rPr>
+        <w:rFonts w:ascii="Wingdings" w:hAnsi="Wingdings" w:hint="default"/>
+        <w:sz w:val="20"/>
+      </w:rPr>
+    </w:lvl>
+    <w:lvl w:ilvl="4" w:tentative="1">
+      <w:start w:val="1"/>
+      <w:numFmt w:val="bullet"/>
+      <w:lvlText w:val=""/>
+      <w:lvlJc w:val="left"/>
+      <w:pPr>
+        <w:tabs>
+          <w:tab w:val="num" w:pos="3600"/>
+        </w:tabs>
+        <w:ind w:left="3600" w:hanging="360"/>
+      </w:pPr>
+      <w:rPr>
+        <w:rFonts w:ascii="Wingdings" w:hAnsi="Wingdings" w:hint="default"/>
+        <w:sz w:val="20"/>
+      </w:rPr>
+    </w:lvl>
+    <w:lvl w:ilvl="5" w:tentative="1">
+      <w:start w:val="1"/>
+      <w:numFmt w:val="bullet"/>
+      <w:lvlText w:val=""/>
+      <w:lvlJc w:val="left"/>
+      <w:pPr>
+        <w:tabs>
+          <w:tab w:val="num" w:pos="4320"/>
+        </w:tabs>
+        <w:ind w:left="4320" w:hanging="360"/>
+      </w:pPr>
+      <w:rPr>
+        <w:rFonts w:ascii="Wingdings" w:hAnsi="Wingdings" w:hint="default"/>
+        <w:sz w:val="20"/>
+      </w:rPr>
+    </w:lvl>
+    <w:lvl w:ilvl="6" w:tentative="1">
+      <w:start w:val="1"/>
+      <w:numFmt w:val="bullet"/>
+      <w:lvlText w:val=""/>
+      <w:lvlJc w:val="left"/>
+      <w:pPr>
+        <w:tabs>
+          <w:tab w:val="num" w:pos="5040"/>
+        </w:tabs>
+        <w:ind w:left="5040" w:hanging="360"/>
+      </w:pPr>
+      <w:rPr>
+        <w:rFonts w:ascii="Wingdings" w:hAnsi="Wingdings" w:hint="default"/>
+        <w:sz w:val="20"/>
+      </w:rPr>
+    </w:lvl>
+    <w:lvl w:ilvl="7" w:tentative="1">
+      <w:start w:val="1"/>
+      <w:numFmt w:val="bullet"/>
+      <w:lvlText w:val=""/>
+      <w:lvlJc w:val="left"/>
+      <w:pPr>
+        <w:tabs>
+          <w:tab w:val="num" w:pos="5760"/>
+        </w:tabs>
+        <w:ind w:left="5760" w:hanging="360"/>
+      </w:pPr>
+      <w:rPr>
+        <w:rFonts w:ascii="Wingdings" w:hAnsi="Wingdings" w:hint="default"/>
+        <w:sz w:val="20"/>
+      </w:rPr>
+    </w:lvl>
+    <w:lvl w:ilvl="8" w:tentative="1">
+      <w:start w:val="1"/>
+      <w:numFmt w:val="bullet"/>
+      <w:lvlText w:val=""/>
+      <w:lvlJc w:val="left"/>
+      <w:pPr>
+        <w:tabs>
+          <w:tab w:val="num" w:pos="6480"/>
+        </w:tabs>
+        <w:ind w:left="6480" w:hanging="360"/>
+      </w:pPr>
+      <w:rPr>
+        <w:rFonts w:ascii="Wingdings" w:hAnsi="Wingdings" w:hint="default"/>
+        <w:sz w:val="20"/>
+      </w:rPr>
+    </w:lvl>
+  </w:abstractNum>
+  <w:abstractNum w:abstractNumId="20" w15:restartNumberingAfterBreak="0">
+    <w:nsid w:val="55A85811"/>
+    <w:multiLevelType w:val="multilevel"/>
+    <w:tmpl w:val="990E1834"/>
+    <w:lvl w:ilvl="0">
+      <w:start w:val="1"/>
+      <w:numFmt w:val="bullet"/>
+      <w:lvlText w:val=""/>
+      <w:lvlJc w:val="left"/>
+      <w:pPr>
+        <w:tabs>
+          <w:tab w:val="num" w:pos="720"/>
+        </w:tabs>
+        <w:ind w:left="720" w:hanging="360"/>
+      </w:pPr>
+      <w:rPr>
+        <w:rFonts w:ascii="Symbol" w:hAnsi="Symbol" w:hint="default"/>
+        <w:sz w:val="20"/>
+      </w:rPr>
+    </w:lvl>
+    <w:lvl w:ilvl="1" w:tentative="1">
+      <w:start w:val="1"/>
+      <w:numFmt w:val="bullet"/>
+      <w:lvlText w:val="o"/>
+      <w:lvlJc w:val="left"/>
+      <w:pPr>
+        <w:tabs>
+          <w:tab w:val="num" w:pos="1440"/>
+        </w:tabs>
+        <w:ind w:left="1440" w:hanging="360"/>
+      </w:pPr>
+      <w:rPr>
+        <w:rFonts w:ascii="Courier New" w:hAnsi="Courier New" w:hint="default"/>
+        <w:sz w:val="20"/>
+      </w:rPr>
+    </w:lvl>
+    <w:lvl w:ilvl="2" w:tentative="1">
+      <w:start w:val="1"/>
+      <w:numFmt w:val="bullet"/>
+      <w:lvlText w:val=""/>
+      <w:lvlJc w:val="left"/>
+      <w:pPr>
+        <w:tabs>
+          <w:tab w:val="num" w:pos="2160"/>
+        </w:tabs>
+        <w:ind w:left="2160" w:hanging="360"/>
+      </w:pPr>
+      <w:rPr>
+        <w:rFonts w:ascii="Wingdings" w:hAnsi="Wingdings" w:hint="default"/>
+        <w:sz w:val="20"/>
+      </w:rPr>
+    </w:lvl>
+    <w:lvl w:ilvl="3" w:tentative="1">
+      <w:start w:val="1"/>
+      <w:numFmt w:val="bullet"/>
+      <w:lvlText w:val=""/>
+      <w:lvlJc w:val="left"/>
+      <w:pPr>
+        <w:tabs>
+          <w:tab w:val="num" w:pos="2880"/>
+        </w:tabs>
+        <w:ind w:left="2880" w:hanging="360"/>
+      </w:pPr>
+      <w:rPr>
+        <w:rFonts w:ascii="Wingdings" w:hAnsi="Wingdings" w:hint="default"/>
+        <w:sz w:val="20"/>
+      </w:rPr>
+    </w:lvl>
+    <w:lvl w:ilvl="4" w:tentative="1">
+      <w:start w:val="1"/>
+      <w:numFmt w:val="bullet"/>
+      <w:lvlText w:val=""/>
+      <w:lvlJc w:val="left"/>
+      <w:pPr>
+        <w:tabs>
+          <w:tab w:val="num" w:pos="3600"/>
+        </w:tabs>
+        <w:ind w:left="3600" w:hanging="360"/>
+      </w:pPr>
+      <w:rPr>
+        <w:rFonts w:ascii="Wingdings" w:hAnsi="Wingdings" w:hint="default"/>
+        <w:sz w:val="20"/>
+      </w:rPr>
+    </w:lvl>
+    <w:lvl w:ilvl="5" w:tentative="1">
+      <w:start w:val="1"/>
+      <w:numFmt w:val="bullet"/>
+      <w:lvlText w:val=""/>
+      <w:lvlJc w:val="left"/>
+      <w:pPr>
+        <w:tabs>
+          <w:tab w:val="num" w:pos="4320"/>
+        </w:tabs>
+        <w:ind w:left="4320" w:hanging="360"/>
+      </w:pPr>
+      <w:rPr>
+        <w:rFonts w:ascii="Wingdings" w:hAnsi="Wingdings" w:hint="default"/>
+        <w:sz w:val="20"/>
+      </w:rPr>
+    </w:lvl>
+    <w:lvl w:ilvl="6" w:tentative="1">
+      <w:start w:val="1"/>
+      <w:numFmt w:val="bullet"/>
+      <w:lvlText w:val=""/>
+      <w:lvlJc w:val="left"/>
+      <w:pPr>
+        <w:tabs>
+          <w:tab w:val="num" w:pos="5040"/>
+        </w:tabs>
+        <w:ind w:left="5040" w:hanging="360"/>
+      </w:pPr>
+      <w:rPr>
+        <w:rFonts w:ascii="Wingdings" w:hAnsi="Wingdings" w:hint="default"/>
+        <w:sz w:val="20"/>
+      </w:rPr>
+    </w:lvl>
+    <w:lvl w:ilvl="7" w:tentative="1">
+      <w:start w:val="1"/>
+      <w:numFmt w:val="bullet"/>
+      <w:lvlText w:val=""/>
+      <w:lvlJc w:val="left"/>
+      <w:pPr>
+        <w:tabs>
+          <w:tab w:val="num" w:pos="5760"/>
+        </w:tabs>
+        <w:ind w:left="5760" w:hanging="360"/>
+      </w:pPr>
+      <w:rPr>
+        <w:rFonts w:ascii="Wingdings" w:hAnsi="Wingdings" w:hint="default"/>
+        <w:sz w:val="20"/>
+      </w:rPr>
+    </w:lvl>
+    <w:lvl w:ilvl="8" w:tentative="1">
+      <w:start w:val="1"/>
+      <w:numFmt w:val="bullet"/>
+      <w:lvlText w:val=""/>
+      <w:lvlJc w:val="left"/>
+      <w:pPr>
+        <w:tabs>
+          <w:tab w:val="num" w:pos="6480"/>
+        </w:tabs>
+        <w:ind w:left="6480" w:hanging="360"/>
+      </w:pPr>
+      <w:rPr>
+        <w:rFonts w:ascii="Wingdings" w:hAnsi="Wingdings" w:hint="default"/>
+        <w:sz w:val="20"/>
+      </w:rPr>
+    </w:lvl>
+  </w:abstractNum>
+  <w:abstractNum w:abstractNumId="21" w15:restartNumberingAfterBreak="0">
     <w:nsid w:val="5DBF25CB"/>
     <w:multiLevelType w:val="multilevel"/>
     <w:tmpl w:val="51B27834"/>
@@ -4714,7 +6632,7 @@
       </w:rPr>
     </w:lvl>
   </w:abstractNum>
-  <w:abstractNum w:abstractNumId="16" w15:restartNumberingAfterBreak="0">
+  <w:abstractNum w:abstractNumId="22" w15:restartNumberingAfterBreak="0">
     <w:nsid w:val="68566F44"/>
     <w:multiLevelType w:val="multilevel"/>
     <w:tmpl w:val="B450D866"/>
@@ -4827,7 +6745,7 @@
       </w:pPr>
     </w:lvl>
   </w:abstractNum>
-  <w:abstractNum w:abstractNumId="17" w15:restartNumberingAfterBreak="0">
+  <w:abstractNum w:abstractNumId="23" w15:restartNumberingAfterBreak="0">
     <w:nsid w:val="75534976"/>
     <w:multiLevelType w:val="multilevel"/>
     <w:tmpl w:val="08BA2F8A"/>
@@ -4976,7 +6894,7 @@
       </w:rPr>
     </w:lvl>
   </w:abstractNum>
-  <w:abstractNum w:abstractNumId="18" w15:restartNumberingAfterBreak="0">
+  <w:abstractNum w:abstractNumId="24" w15:restartNumberingAfterBreak="0">
     <w:nsid w:val="78EC531A"/>
     <w:multiLevelType w:val="multilevel"/>
     <w:tmpl w:val="9134DFF2"/>
@@ -5089,7 +7007,7 @@
       </w:pPr>
     </w:lvl>
   </w:abstractNum>
-  <w:abstractNum w:abstractNumId="19" w15:restartNumberingAfterBreak="0">
+  <w:abstractNum w:abstractNumId="25" w15:restartNumberingAfterBreak="0">
     <w:nsid w:val="7CA10893"/>
     <w:multiLevelType w:val="multilevel"/>
     <w:tmpl w:val="42BE07F2"/>
@@ -5239,64 +7157,82 @@
     </w:lvl>
   </w:abstractNum>
   <w:num w:numId="1">
+    <w:abstractNumId w:val="15"/>
+  </w:num>
+  <w:num w:numId="2">
+    <w:abstractNumId w:val="23"/>
+  </w:num>
+  <w:num w:numId="3">
+    <w:abstractNumId w:val="4"/>
+  </w:num>
+  <w:num w:numId="4">
+    <w:abstractNumId w:val="17"/>
+  </w:num>
+  <w:num w:numId="5">
+    <w:abstractNumId w:val="10"/>
+  </w:num>
+  <w:num w:numId="6">
+    <w:abstractNumId w:val="22"/>
+  </w:num>
+  <w:num w:numId="7">
+    <w:abstractNumId w:val="16"/>
+  </w:num>
+  <w:num w:numId="8">
+    <w:abstractNumId w:val="21"/>
+  </w:num>
+  <w:num w:numId="9">
+    <w:abstractNumId w:val="25"/>
+  </w:num>
+  <w:num w:numId="10">
+    <w:abstractNumId w:val="24"/>
+  </w:num>
+  <w:num w:numId="11">
+    <w:abstractNumId w:val="14"/>
+  </w:num>
+  <w:num w:numId="12">
+    <w:abstractNumId w:val="3"/>
+  </w:num>
+  <w:num w:numId="13">
+    <w:abstractNumId w:val="12"/>
+  </w:num>
+  <w:num w:numId="14">
+    <w:abstractNumId w:val="13"/>
+  </w:num>
+  <w:num w:numId="15">
     <w:abstractNumId w:val="11"/>
   </w:num>
-  <w:num w:numId="2">
-    <w:abstractNumId w:val="17"/>
+  <w:num w:numId="16">
+    <w:abstractNumId w:val="6"/>
   </w:num>
-  <w:num w:numId="3">
+  <w:num w:numId="17">
     <w:abstractNumId w:val="2"/>
   </w:num>
-  <w:num w:numId="4">
-    <w:abstractNumId w:val="13"/>
+  <w:num w:numId="18">
+    <w:abstractNumId w:val="18"/>
   </w:num>
-  <w:num w:numId="5">
-    <w:abstractNumId w:val="6"/>
+  <w:num w:numId="19">
+    <w:abstractNumId w:val="9"/>
   </w:num>
-  <w:num w:numId="6">
-    <w:abstractNumId w:val="16"/>
+  <w:num w:numId="20">
+    <w:abstractNumId w:val="8"/>
   </w:num>
-  <w:num w:numId="7">
-    <w:abstractNumId w:val="12"/>
+  <w:num w:numId="21">
+    <w:abstractNumId w:val="0"/>
   </w:num>
-  <w:num w:numId="8">
-    <w:abstractNumId w:val="15"/>
+  <w:num w:numId="22">
+    <w:abstractNumId w:val="7"/>
   </w:num>
-  <w:num w:numId="9">
+  <w:num w:numId="23">
+    <w:abstractNumId w:val="5"/>
+  </w:num>
+  <w:num w:numId="24">
+    <w:abstractNumId w:val="1"/>
+  </w:num>
+  <w:num w:numId="25">
     <w:abstractNumId w:val="19"/>
   </w:num>
-  <w:num w:numId="10">
-    <w:abstractNumId w:val="18"/>
-  </w:num>
-  <w:num w:numId="11">
-    <w:abstractNumId w:val="10"/>
-  </w:num>
-  <w:num w:numId="12">
-    <w:abstractNumId w:val="1"/>
-  </w:num>
-  <w:num w:numId="13">
-    <w:abstractNumId w:val="8"/>
-  </w:num>
-  <w:num w:numId="14">
-    <w:abstractNumId w:val="9"/>
-  </w:num>
-  <w:num w:numId="15">
-    <w:abstractNumId w:val="7"/>
-  </w:num>
-  <w:num w:numId="16">
-    <w:abstractNumId w:val="3"/>
-  </w:num>
-  <w:num w:numId="17">
-    <w:abstractNumId w:val="0"/>
-  </w:num>
-  <w:num w:numId="18">
-    <w:abstractNumId w:val="14"/>
-  </w:num>
-  <w:num w:numId="19">
-    <w:abstractNumId w:val="5"/>
-  </w:num>
-  <w:num w:numId="20">
-    <w:abstractNumId w:val="4"/>
+  <w:num w:numId="26">
+    <w:abstractNumId w:val="20"/>
   </w:num>
   <w:numIdMacAtCleanup w:val="3"/>
 </w:numbering>
@@ -6531,7 +8467,7 @@
 </file>
 
 <file path=customXml/itemProps1.xml><?xml version="1.0" encoding="utf-8"?>
-<ds:datastoreItem xmlns:ds="http://schemas.openxmlformats.org/officeDocument/2006/customXml" ds:itemID="{761FE4A1-979C-41AD-94CE-812017EEA144}">
+<ds:datastoreItem xmlns:ds="http://schemas.openxmlformats.org/officeDocument/2006/customXml" ds:itemID="{C0740A93-7554-4A61-A3D0-A3EA15D7BC7B}">
   <ds:schemaRefs>
     <ds:schemaRef ds:uri="http://schemas.openxmlformats.org/officeDocument/2006/bibliography"/>
   </ds:schemaRefs>

</xml_diff>